<commit_message>
Updating academic portfolio content
</commit_message>
<xml_diff>
--- a/dist/assets/phoebien-canete-cv.docx
+++ b/dist/assets/phoebien-canete-cv.docx
@@ -20,7 +20,7 @@
       <w:pPr>
         <w:pStyle w:val="CVFocus"/>
         <w:rPr>
-          <w:color w:val="auto"/>
+          <w:color w:val="0D0D0D" w:themeColor="text1" w:themeTint="F2"/>
         </w:rPr>
       </w:pPr>
       <w:r>
@@ -53,68 +53,62 @@
         <w:rPr>
           <w:color w:val="auto"/>
         </w:rPr>
-        <w:t>| Internet of Things</w:t>
-      </w:r>
-      <w:r>
-        <w:rPr>
-          <w:color w:val="auto"/>
-        </w:rPr>
-        <w:t xml:space="preserve"> </w:t>
-      </w:r>
-      <w:r>
-        <w:rPr>
-          <w:color w:val="auto"/>
-        </w:rPr>
-        <w:t xml:space="preserve">| </w:t>
-      </w:r>
-      <w:r>
-        <w:rPr>
-          <w:color w:val="auto"/>
-        </w:rPr>
-        <w:t>Research</w:t>
+        <w:t xml:space="preserve">| Internet of </w:t>
+      </w:r>
+      <w:r>
+        <w:rPr>
+          <w:color w:val="0D0D0D" w:themeColor="text1" w:themeTint="F2"/>
+        </w:rPr>
+        <w:t>Things</w:t>
+      </w:r>
+      <w:r>
+        <w:rPr>
+          <w:color w:val="0D0D0D" w:themeColor="text1" w:themeTint="F2"/>
+        </w:rPr>
+        <w:t xml:space="preserve"> | Research</w:t>
       </w:r>
     </w:p>
     <w:p>
       <w:pPr>
         <w:pStyle w:val="CVContact"/>
         <w:rPr>
-          <w:color w:val="auto"/>
-        </w:rPr>
-      </w:pPr>
-      <w:r>
-        <w:rPr>
-          <w:color w:val="auto"/>
+          <w:color w:val="0D0D0D" w:themeColor="text1" w:themeTint="F2"/>
+        </w:rPr>
+      </w:pPr>
+      <w:r>
+        <w:rPr>
+          <w:color w:val="0D0D0D" w:themeColor="text1" w:themeTint="F2"/>
         </w:rPr>
         <w:t xml:space="preserve">Iligan City, Philippines • phoebiend@gmail.com • </w:t>
       </w:r>
       <w:r>
         <w:rPr>
-          <w:color w:val="auto"/>
+          <w:color w:val="0D0D0D" w:themeColor="text1" w:themeTint="F2"/>
         </w:rPr>
         <w:t>(</w:t>
       </w:r>
       <w:r>
         <w:rPr>
-          <w:color w:val="auto"/>
+          <w:color w:val="0D0D0D" w:themeColor="text1" w:themeTint="F2"/>
         </w:rPr>
         <w:t>+63</w:t>
       </w:r>
       <w:r>
         <w:rPr>
-          <w:color w:val="auto"/>
+          <w:color w:val="0D0D0D" w:themeColor="text1" w:themeTint="F2"/>
         </w:rPr>
         <w:t>)</w:t>
       </w:r>
       <w:r>
         <w:rPr>
-          <w:color w:val="auto"/>
+          <w:color w:val="0D0D0D" w:themeColor="text1" w:themeTint="F2"/>
         </w:rPr>
         <w:t xml:space="preserve"> 905 610 0216 • </w:t>
       </w:r>
       <w:hyperlink r:id="rId6">
         <w:r>
           <w:rPr>
-            <w:color w:val="auto"/>
+            <w:color w:val="0D0D0D" w:themeColor="text1" w:themeTint="F2"/>
             <w:u w:val="single"/>
           </w:rPr>
           <w:t>GitHub</w:t>
@@ -122,7 +116,7 @@
       </w:hyperlink>
       <w:r>
         <w:rPr>
-          <w:color w:val="auto"/>
+          <w:color w:val="0D0D0D" w:themeColor="text1" w:themeTint="F2"/>
         </w:rPr>
         <w:t xml:space="preserve"> • </w:t>
       </w:r>
@@ -130,7 +124,7 @@
         <w:proofErr w:type="spellStart"/>
         <w:r>
           <w:rPr>
-            <w:color w:val="auto"/>
+            <w:color w:val="0D0D0D" w:themeColor="text1" w:themeTint="F2"/>
             <w:u w:val="single"/>
           </w:rPr>
           <w:t>Hackster</w:t>
@@ -139,50 +133,84 @@
       </w:hyperlink>
       <w:r>
         <w:rPr>
-          <w:color w:val="auto"/>
+          <w:color w:val="0D0D0D" w:themeColor="text1" w:themeTint="F2"/>
         </w:rPr>
         <w:t xml:space="preserve"> • </w:t>
       </w:r>
       <w:hyperlink r:id="rId8">
         <w:r>
           <w:rPr>
-            <w:color w:val="auto"/>
+            <w:color w:val="0D0D0D" w:themeColor="text1" w:themeTint="F2"/>
             <w:u w:val="single"/>
           </w:rPr>
-          <w:t>Linke</w:t>
+          <w:t>LinkedIn</w:t>
+        </w:r>
+      </w:hyperlink>
+      <w:r>
+        <w:rPr>
+          <w:color w:val="0D0D0D" w:themeColor="text1" w:themeTint="F2"/>
+        </w:rPr>
+        <w:t xml:space="preserve"> • </w:t>
+      </w:r>
+      <w:hyperlink r:id="rId9" w:history="1">
+        <w:r>
+          <w:rPr>
+            <w:rStyle w:val="Hyperlink"/>
+            <w:color w:val="0D0D0D" w:themeColor="text1" w:themeTint="F2"/>
+          </w:rPr>
+          <w:t>P</w:t>
         </w:r>
         <w:r>
           <w:rPr>
-            <w:color w:val="auto"/>
-            <w:u w:val="single"/>
+            <w:rStyle w:val="Hyperlink"/>
+            <w:color w:val="0D0D0D" w:themeColor="text1" w:themeTint="F2"/>
           </w:rPr>
-          <w:t>d</w:t>
-        </w:r>
-        <w:r>
-          <w:rPr>
-            <w:color w:val="auto"/>
-            <w:u w:val="single"/>
-          </w:rPr>
-          <w:t>In</w:t>
+          <w:t>ersonal Website</w:t>
         </w:r>
       </w:hyperlink>
-      <w:r>
-        <w:rPr>
-          <w:color w:val="auto"/>
-        </w:rPr>
-        <w:t xml:space="preserve"> </w:t>
-      </w:r>
     </w:p>
     <w:p>
       <w:pPr>
         <w:pStyle w:val="Heading1"/>
         <w:rPr>
-          <w:color w:val="auto"/>
-        </w:rPr>
-      </w:pPr>
-      <w:r>
-        <w:rPr>
-          <w:color w:val="auto"/>
+          <w:color w:val="0D0D0D" w:themeColor="text1" w:themeTint="F2"/>
+        </w:rPr>
+      </w:pPr>
+      <w:r>
+        <w:rPr>
+          <w:color w:val="0D0D0D" w:themeColor="text1" w:themeTint="F2"/>
+        </w:rPr>
+        <w:t>Academic Profile</w:t>
+      </w:r>
+    </w:p>
+    <w:p>
+      <w:pPr>
+        <w:pStyle w:val="CVContact"/>
+        <w:keepNext w:val="0"/>
+        <w:jc w:val="both"/>
+        <w:rPr>
+          <w:color w:val="0D0D0D" w:themeColor="text1" w:themeTint="F2"/>
+          <w:lang w:val="en-PH"/>
+        </w:rPr>
+      </w:pPr>
+      <w:r>
+        <w:rPr>
+          <w:color w:val="0D0D0D" w:themeColor="text1" w:themeTint="F2"/>
+          <w:lang w:val="en-PH"/>
+        </w:rPr>
+        <w:t>Phoebien D. Cañete develops embedded prototypes for sensor monitoring and activity recognition while pursuing a BS in Computer Applications, majoring in Embedded Systems, at Mindanao State University–Iligan Institute of Technology. Current research contributions include an ongoing university-funded study on aphid-damage detection using edge AI and a systematic literature review on bell-pepper disease and pest monitoring. Experience in real-time embedded programming and digital fabrication complements involvement in student government and technology events. Phoebien hopes to deepen this technical foundation through research placements abroad and collaborative projects that connect embedded computing with practical applications.</w:t>
+      </w:r>
+    </w:p>
+    <w:p>
+      <w:pPr>
+        <w:pStyle w:val="Heading1"/>
+        <w:rPr>
+          <w:color w:val="0D0D0D" w:themeColor="text1" w:themeTint="F2"/>
+        </w:rPr>
+      </w:pPr>
+      <w:r>
+        <w:rPr>
+          <w:color w:val="0D0D0D" w:themeColor="text1" w:themeTint="F2"/>
         </w:rPr>
         <w:t>Education</w:t>
       </w:r>
@@ -195,6 +223,7 @@
           <w:ilvl w:val="0"/>
           <w:numId w:val="1"/>
         </w:numPr>
+        <w:jc w:val="both"/>
         <w:rPr>
           <w:color w:val="auto"/>
         </w:rPr>
@@ -257,6 +286,7 @@
           <w:ilvl w:val="0"/>
           <w:numId w:val="1"/>
         </w:numPr>
+        <w:jc w:val="both"/>
         <w:rPr>
           <w:color w:val="auto"/>
         </w:rPr>
@@ -290,6 +320,7 @@
     <w:p>
       <w:pPr>
         <w:pStyle w:val="Heading1"/>
+        <w:jc w:val="both"/>
         <w:rPr>
           <w:color w:val="auto"/>
         </w:rPr>
@@ -299,6 +330,45 @@
           <w:color w:val="auto"/>
         </w:rPr>
         <w:t>Experience</w:t>
+      </w:r>
+    </w:p>
+    <w:p>
+      <w:pPr>
+        <w:pStyle w:val="CVEntry"/>
+        <w:keepLines/>
+        <w:numPr>
+          <w:ilvl w:val="0"/>
+          <w:numId w:val="1"/>
+        </w:numPr>
+        <w:jc w:val="both"/>
+        <w:rPr>
+          <w:color w:val="auto"/>
+        </w:rPr>
+      </w:pPr>
+      <w:r>
+        <w:rPr>
+          <w:b/>
+          <w:color w:val="auto"/>
+        </w:rPr>
+        <w:t>Online ESL Teacher</w:t>
+      </w:r>
+      <w:r>
+        <w:rPr>
+          <w:color w:val="auto"/>
+        </w:rPr>
+        <w:t xml:space="preserve"> — NativeCamp | Remote (August 2025 – </w:t>
+      </w:r>
+      <w:r>
+        <w:rPr>
+          <w:color w:val="auto"/>
+        </w:rPr>
+        <w:t>Present</w:t>
+      </w:r>
+      <w:r>
+        <w:rPr>
+          <w:color w:val="auto"/>
+        </w:rPr>
+        <w:t>)</w:t>
       </w:r>
     </w:p>
     <w:p>
@@ -310,6 +380,7 @@
           <w:ilvl w:val="0"/>
           <w:numId w:val="1"/>
         </w:numPr>
+        <w:jc w:val="both"/>
         <w:rPr>
           <w:color w:val="auto"/>
         </w:rPr>
@@ -319,36 +390,121 @@
           <w:b/>
           <w:color w:val="auto"/>
         </w:rPr>
-        <w:t>Online ESL Teacher</w:t>
-      </w:r>
-      <w:r>
-        <w:rPr>
-          <w:color w:val="auto"/>
-        </w:rPr>
-        <w:t xml:space="preserve"> — NativeCamp | Remote (August 2025 – </w:t>
-      </w:r>
-      <w:r>
-        <w:rPr>
-          <w:color w:val="auto"/>
-        </w:rPr>
-        <w:t>Present</w:t>
-      </w:r>
-      <w:r>
-        <w:rPr>
-          <w:color w:val="auto"/>
-        </w:rPr>
-        <w:t>)</w:t>
+        <w:t>Student Intern</w:t>
+      </w:r>
+      <w:r>
+        <w:rPr>
+          <w:color w:val="auto"/>
+        </w:rPr>
+        <w:t xml:space="preserve"> — MSU</w:t>
+      </w:r>
+      <w:r>
+        <w:rPr>
+          <w:color w:val="auto"/>
+        </w:rPr>
+        <w:t>-</w:t>
+      </w:r>
+      <w:r>
+        <w:rPr>
+          <w:color w:val="auto"/>
+        </w:rPr>
+        <w:t>IIT FAB LAB Mindanao | Work Immersion (February – March 2023)</w:t>
       </w:r>
     </w:p>
     <w:p>
       <w:pPr>
+        <w:pStyle w:val="CVDetail"/>
+        <w:keepLines/>
+        <w:jc w:val="both"/>
+        <w:rPr>
+          <w:color w:val="auto"/>
+        </w:rPr>
+      </w:pPr>
+      <w:r>
+        <w:rPr>
+          <w:color w:val="auto"/>
+        </w:rPr>
+        <w:t>Operated laser cutters and CNC routers, created 2D designs and 3D models using Autodesk Fusion 360 and Adobe Photoshop, and supported equipment maintenance and STEM projects</w:t>
+      </w:r>
+    </w:p>
+    <w:p>
+      <w:pPr>
+        <w:pStyle w:val="Heading1"/>
+        <w:rPr>
+          <w:lang w:val="en-PH"/>
+        </w:rPr>
+      </w:pPr>
+      <w:r>
+        <w:rPr>
+          <w:lang w:val="en-PH"/>
+        </w:rPr>
+        <w:t>Peer-Reviewed Conference Papers</w:t>
+      </w:r>
+    </w:p>
+    <w:p>
+      <w:pPr>
+        <w:pStyle w:val="ListBullet"/>
+      </w:pPr>
+      <w:proofErr w:type="spellStart"/>
+      <w:r>
+        <w:rPr>
+          <w:lang w:val="en-PH"/>
+        </w:rPr>
+        <w:t>Listanco</w:t>
+      </w:r>
+      <w:proofErr w:type="spellEnd"/>
+      <w:r>
+        <w:rPr>
+          <w:lang w:val="en-PH"/>
+        </w:rPr>
+        <w:t xml:space="preserve">, T., </w:t>
+      </w:r>
+      <w:r>
+        <w:rPr>
+          <w:b/>
+          <w:bCs/>
+          <w:lang w:val="en-PH"/>
+        </w:rPr>
+        <w:t>Cañete, P.,</w:t>
+      </w:r>
+      <w:r>
+        <w:rPr>
+          <w:lang w:val="en-PH"/>
+        </w:rPr>
+        <w:t xml:space="preserve"> Tanque, S. R., Alce, A. R. B., &amp; Castor, P. R. P., “Computational Approaches, Evidence Maturity, and Research Gaps in Bell-Pepper Disease and Pest Monitoring: A Systematic Literature Review.” 17th International Conference on Emerging Ubiquitous Systems and Pervasive Networks (EUSPN 2026), Almaty, Kazakhstan, October 28–30, 2026.</w:t>
+      </w:r>
+    </w:p>
+    <w:p>
+      <w:pPr>
+        <w:pStyle w:val="Heading1"/>
+        <w:jc w:val="both"/>
+        <w:rPr>
+          <w:color w:val="auto"/>
+          <w:lang w:val="en-PH"/>
+        </w:rPr>
+      </w:pPr>
+      <w:r>
+        <w:rPr>
+          <w:color w:val="auto"/>
+        </w:rPr>
+        <w:t xml:space="preserve">Selected </w:t>
+      </w:r>
+      <w:r>
+        <w:rPr>
+          <w:color w:val="auto"/>
+        </w:rPr>
+        <w:t>Projects</w:t>
+      </w:r>
+    </w:p>
+    <w:p>
+      <w:pPr>
         <w:pStyle w:val="CVEntry"/>
-        <w:keepNext/>
         <w:keepLines/>
         <w:numPr>
           <w:ilvl w:val="0"/>
           <w:numId w:val="1"/>
         </w:numPr>
+        <w:jc w:val="both"/>
         <w:rPr>
           <w:color w:val="auto"/>
         </w:rPr>
@@ -358,163 +514,6 @@
           <w:b/>
           <w:color w:val="auto"/>
         </w:rPr>
-        <w:t>Student Intern</w:t>
-      </w:r>
-      <w:r>
-        <w:rPr>
-          <w:color w:val="auto"/>
-        </w:rPr>
-        <w:t xml:space="preserve"> — MSU</w:t>
-      </w:r>
-      <w:r>
-        <w:rPr>
-          <w:color w:val="auto"/>
-        </w:rPr>
-        <w:t>-</w:t>
-      </w:r>
-      <w:r>
-        <w:rPr>
-          <w:color w:val="auto"/>
-        </w:rPr>
-        <w:t>IIT FAB LAB Mindanao | Work Immersion (February – March 2023)</w:t>
-      </w:r>
-    </w:p>
-    <w:p>
-      <w:pPr>
-        <w:pStyle w:val="CVDetail"/>
-        <w:keepLines/>
-        <w:rPr>
-          <w:color w:val="auto"/>
-        </w:rPr>
-      </w:pPr>
-      <w:r>
-        <w:rPr>
-          <w:color w:val="auto"/>
-        </w:rPr>
-        <w:t>Operated laser cutters and CNC routers, created 2D designs and 3D models using Autodesk Fusion 360 and Adobe Photoshop, and supported equipment maintenance and STEM projects</w:t>
-      </w:r>
-    </w:p>
-    <w:p>
-      <w:pPr>
-        <w:pStyle w:val="CVDetail"/>
-        <w:keepLines/>
-        <w:ind w:left="0"/>
-        <w:rPr>
-          <w:b/>
-          <w:bCs/>
-          <w:color w:val="auto"/>
-          <w:lang w:val="en-PH"/>
-        </w:rPr>
-      </w:pPr>
-      <w:r>
-        <w:rPr>
-          <w:b/>
-          <w:bCs/>
-          <w:color w:val="auto"/>
-          <w:lang w:val="en-PH"/>
-        </w:rPr>
-        <w:t>Peer-Reviewed Conference Papers</w:t>
-      </w:r>
-    </w:p>
-    <w:p>
-      <w:pPr>
-        <w:pStyle w:val="CVEntry"/>
-        <w:keepNext/>
-        <w:keepLines/>
-        <w:numPr>
-          <w:ilvl w:val="0"/>
-          <w:numId w:val="1"/>
-        </w:numPr>
-        <w:rPr>
-          <w:color w:val="auto"/>
-        </w:rPr>
-      </w:pPr>
-      <w:proofErr w:type="spellStart"/>
-      <w:r>
-        <w:rPr>
-          <w:color w:val="auto"/>
-          <w:lang w:val="en-PH"/>
-        </w:rPr>
-        <w:t>Listanco</w:t>
-      </w:r>
-      <w:proofErr w:type="spellEnd"/>
-      <w:r>
-        <w:rPr>
-          <w:color w:val="auto"/>
-          <w:lang w:val="en-PH"/>
-        </w:rPr>
-        <w:t xml:space="preserve">, T., </w:t>
-      </w:r>
-      <w:r>
-        <w:rPr>
-          <w:b/>
-          <w:bCs/>
-          <w:color w:val="auto"/>
-          <w:lang w:val="en-PH"/>
-        </w:rPr>
-        <w:t>Cañete, P</w:t>
-      </w:r>
-      <w:r>
-        <w:rPr>
-          <w:color w:val="auto"/>
-          <w:lang w:val="en-PH"/>
-        </w:rPr>
-        <w:t>., Tanque, S. R., Alce, A. R. B., &amp; Castor, P. R. P., “Computational Approaches, Evidence Maturity, and Research Gaps in Bell-Pepper Disease and Pest Monitoring: A Systematic Literature Review.” 17th International Conference on Emerging Ubiquitous Systems and Pervasive Networks (EUSPN 2026), Almaty, Kazakhstan, October 28</w:t>
-      </w:r>
-      <w:r>
-        <w:rPr>
-          <w:color w:val="auto"/>
-          <w:lang w:val="en-PH"/>
-        </w:rPr>
-        <w:t>-</w:t>
-      </w:r>
-      <w:r>
-        <w:rPr>
-          <w:color w:val="auto"/>
-          <w:lang w:val="en-PH"/>
-        </w:rPr>
-        <w:t>30, 2026.</w:t>
-      </w:r>
-    </w:p>
-    <w:p>
-      <w:pPr>
-        <w:pStyle w:val="Heading1"/>
-        <w:rPr>
-          <w:color w:val="auto"/>
-          <w:lang w:val="en-PH"/>
-        </w:rPr>
-      </w:pPr>
-      <w:r>
-        <w:rPr>
-          <w:color w:val="auto"/>
-        </w:rPr>
-        <w:t xml:space="preserve">Selected </w:t>
-      </w:r>
-      <w:r>
-        <w:rPr>
-          <w:color w:val="auto"/>
-        </w:rPr>
-        <w:t>Projects</w:t>
-      </w:r>
-    </w:p>
-    <w:p>
-      <w:pPr>
-        <w:pStyle w:val="CVEntry"/>
-        <w:keepNext/>
-        <w:keepLines/>
-        <w:numPr>
-          <w:ilvl w:val="0"/>
-          <w:numId w:val="1"/>
-        </w:numPr>
-        <w:rPr>
-          <w:color w:val="auto"/>
-        </w:rPr>
-      </w:pPr>
-      <w:r>
-        <w:rPr>
-          <w:b/>
-          <w:color w:val="auto"/>
-        </w:rPr>
         <w:t>Development of an Edge-IoT-Based Aphid Damage Detection using YOLOv8n and Offline Monitoring using Flask Web Interface for Bell Pepper (Capsicum annuum) on a Raspberry Pi 5</w:t>
       </w:r>
       <w:r>
@@ -527,94 +526,7 @@
         <w:rPr>
           <w:color w:val="auto"/>
         </w:rPr>
-        <w:t xml:space="preserve"> </w:t>
-      </w:r>
-      <w:r>
-        <w:rPr>
-          <w:color w:val="auto"/>
-        </w:rPr>
-        <w:t xml:space="preserve">— Design and develop an edge-IoT system using Raspberry Pi 5 and YOLOv8n to detect aphid damage in bell pepper plants through image recognition, with a Flask-based web interface to display detection results and support local monitoring without an internet </w:t>
-      </w:r>
-      <w:r>
-        <w:rPr>
-          <w:color w:val="auto"/>
-        </w:rPr>
-        <w:t xml:space="preserve">connection. </w:t>
-      </w:r>
-      <w:hyperlink r:id="rId9" w:history="1">
-        <w:r>
-          <w:rPr>
-            <w:rStyle w:val="Hyperlink"/>
-            <w:color w:val="7030A0"/>
-          </w:rPr>
-          <w:t>Resea</w:t>
-        </w:r>
-        <w:r>
-          <w:rPr>
-            <w:rStyle w:val="Hyperlink"/>
-            <w:color w:val="7030A0"/>
-          </w:rPr>
-          <w:t>r</w:t>
-        </w:r>
-        <w:r>
-          <w:rPr>
-            <w:rStyle w:val="Hyperlink"/>
-            <w:color w:val="7030A0"/>
-          </w:rPr>
-          <w:t>ch Page</w:t>
-        </w:r>
-      </w:hyperlink>
-    </w:p>
-    <w:p>
-      <w:pPr>
-        <w:pStyle w:val="CVEntry"/>
-        <w:keepNext/>
-        <w:keepLines/>
-        <w:numPr>
-          <w:ilvl w:val="0"/>
-          <w:numId w:val="1"/>
-        </w:numPr>
-        <w:rPr>
-          <w:color w:val="auto"/>
-        </w:rPr>
-      </w:pPr>
-      <w:r>
-        <w:rPr>
-          <w:b/>
-          <w:color w:val="auto"/>
-        </w:rPr>
-        <w:t>RT-Spark Activity Recognition</w:t>
-      </w:r>
-      <w:r>
-        <w:rPr>
-          <w:b/>
-          <w:color w:val="auto"/>
-        </w:rPr>
-        <w:t xml:space="preserve"> </w:t>
-      </w:r>
-      <w:r>
-        <w:rPr>
-          <w:color w:val="auto"/>
-        </w:rPr>
-        <w:t xml:space="preserve">— </w:t>
-      </w:r>
-      <w:r>
-        <w:rPr>
-          <w:color w:val="auto"/>
-        </w:rPr>
-        <w:t>An</w:t>
-      </w:r>
-      <w:r>
-        <w:rPr>
-          <w:color w:val="auto"/>
-        </w:rPr>
-        <w:t xml:space="preserve"> RT-Thread prototype that streams six-axis inertial data over Wi-Fi using MQTT/TLS to a cloud-based walking/running classifier, along with Python tools to capture labeled accelerometer and gyroscope readings and prepare compatible sensor payloads for classification.</w:t>
-      </w:r>
-      <w:r>
-        <w:rPr>
-          <w:color w:val="auto"/>
-        </w:rPr>
-        <w:t xml:space="preserve"> </w:t>
+        <w:t xml:space="preserve"> — Design and develop an edge-IoT system using Raspberry Pi 5 and YOLOv8n to detect aphid damage in bell pepper plants through image recognition, with a Flask-based web interface to display detection results and support local monitoring without an internet connection. </w:t>
       </w:r>
       <w:hyperlink r:id="rId10" w:history="1">
         <w:r>
@@ -622,381 +534,253 @@
             <w:rStyle w:val="Hyperlink"/>
             <w:color w:val="7030A0"/>
           </w:rPr>
-          <w:t>GitHub R</w:t>
+          <w:t>Research Page</w:t>
         </w:r>
+      </w:hyperlink>
+    </w:p>
+    <w:p>
+      <w:pPr>
+        <w:pStyle w:val="CVEntry"/>
+        <w:keepLines/>
+        <w:numPr>
+          <w:ilvl w:val="0"/>
+          <w:numId w:val="1"/>
+        </w:numPr>
+        <w:jc w:val="both"/>
+        <w:rPr>
+          <w:color w:val="auto"/>
+        </w:rPr>
+      </w:pPr>
+      <w:r>
+        <w:rPr>
+          <w:b/>
+          <w:color w:val="auto"/>
+        </w:rPr>
+        <w:t>RT-Spark Activity Recognition</w:t>
+      </w:r>
+      <w:r>
+        <w:rPr>
+          <w:b/>
+          <w:color w:val="auto"/>
+        </w:rPr>
+        <w:t xml:space="preserve"> </w:t>
+      </w:r>
+      <w:r>
+        <w:rPr>
+          <w:color w:val="auto"/>
+        </w:rPr>
+        <w:t xml:space="preserve">— </w:t>
+      </w:r>
+      <w:r>
+        <w:rPr>
+          <w:color w:val="auto"/>
+        </w:rPr>
+        <w:t>An</w:t>
+      </w:r>
+      <w:r>
+        <w:rPr>
+          <w:color w:val="auto"/>
+        </w:rPr>
+        <w:t xml:space="preserve"> RT-Thread prototype that streams six-axis inertial data over Wi-Fi using MQTT/TLS to a cloud-based walking/running classifier, along with Python tools to capture labeled accelerometer and gyroscope readings and prepare compatible sensor payloads for classification.</w:t>
+      </w:r>
+      <w:r>
+        <w:rPr>
+          <w:color w:val="auto"/>
+        </w:rPr>
+        <w:t xml:space="preserve"> </w:t>
+      </w:r>
+      <w:hyperlink r:id="rId11" w:history="1">
         <w:r>
           <w:rPr>
             <w:rStyle w:val="Hyperlink"/>
             <w:color w:val="7030A0"/>
           </w:rPr>
-          <w:t>e</w:t>
+          <w:t>GitHub Repository</w:t>
         </w:r>
+      </w:hyperlink>
+    </w:p>
+    <w:p>
+      <w:pPr>
+        <w:pStyle w:val="CVEntry"/>
+        <w:keepLines/>
+        <w:numPr>
+          <w:ilvl w:val="0"/>
+          <w:numId w:val="1"/>
+        </w:numPr>
+        <w:jc w:val="both"/>
+        <w:rPr>
+          <w:color w:val="auto"/>
+        </w:rPr>
+      </w:pPr>
+      <w:r>
+        <w:rPr>
+          <w:b/>
+          <w:color w:val="auto"/>
+        </w:rPr>
+        <w:t xml:space="preserve">Real-Time </w:t>
+      </w:r>
+      <w:proofErr w:type="spellStart"/>
+      <w:r>
+        <w:rPr>
+          <w:b/>
+          <w:color w:val="auto"/>
+        </w:rPr>
+        <w:t>Multisensor</w:t>
+      </w:r>
+      <w:proofErr w:type="spellEnd"/>
+      <w:r>
+        <w:rPr>
+          <w:b/>
+          <w:color w:val="auto"/>
+        </w:rPr>
+        <w:t xml:space="preserve"> Room Monitor</w:t>
+      </w:r>
+      <w:r>
+        <w:rPr>
+          <w:b/>
+          <w:color w:val="auto"/>
+        </w:rPr>
+        <w:t xml:space="preserve"> </w:t>
+      </w:r>
+      <w:r>
+        <w:rPr>
+          <w:color w:val="auto"/>
+        </w:rPr>
+        <w:t>—</w:t>
+      </w:r>
+      <w:r>
+        <w:rPr>
+          <w:color w:val="auto"/>
+        </w:rPr>
+        <w:t xml:space="preserve"> </w:t>
+      </w:r>
+      <w:proofErr w:type="spellStart"/>
+      <w:r>
+        <w:rPr>
+          <w:color w:val="auto"/>
+        </w:rPr>
+        <w:t>FreeRTOS</w:t>
+      </w:r>
+      <w:proofErr w:type="spellEnd"/>
+      <w:r>
+        <w:rPr>
+          <w:color w:val="auto"/>
+        </w:rPr>
+        <w:t xml:space="preserve"> tasks on an STM32 Blue Pill for sensor acquisition, OLED display, rotary-encoder input, motion monitoring, and temperature alarms, coordinated them using queues, event groups, and a serial mutex, and documented 10 functional checks covering sensor updates, navigation, alarms, and activity-state transitions. </w:t>
+      </w:r>
+      <w:hyperlink r:id="rId12">
+        <w:r>
+          <w:rPr>
+            <w:color w:val="7030A0"/>
+            <w:u w:val="single"/>
+          </w:rPr>
+          <w:t>GitHub repository</w:t>
+        </w:r>
+      </w:hyperlink>
+    </w:p>
+    <w:p>
+      <w:pPr>
+        <w:pStyle w:val="CVEntry"/>
+        <w:keepLines/>
+        <w:numPr>
+          <w:ilvl w:val="0"/>
+          <w:numId w:val="1"/>
+        </w:numPr>
+        <w:jc w:val="both"/>
+        <w:rPr>
+          <w:color w:val="auto"/>
+        </w:rPr>
+      </w:pPr>
+      <w:r>
+        <w:rPr>
+          <w:b/>
+          <w:color w:val="auto"/>
+        </w:rPr>
+        <w:t>Smart Inventory Sorting System</w:t>
+      </w:r>
+      <w:r>
+        <w:rPr>
+          <w:b/>
+          <w:color w:val="auto"/>
+        </w:rPr>
+        <w:t xml:space="preserve"> </w:t>
+      </w:r>
+      <w:r>
+        <w:rPr>
+          <w:color w:val="auto"/>
+        </w:rPr>
+        <w:t xml:space="preserve">— </w:t>
+      </w:r>
+      <w:r>
+        <w:rPr>
+          <w:color w:val="auto"/>
+        </w:rPr>
+        <w:t>A</w:t>
+      </w:r>
+      <w:r>
+        <w:rPr>
+          <w:color w:val="auto"/>
+        </w:rPr>
+        <w:t xml:space="preserve"> desktop software prototype using C++17, Qt Widgets, and SQLite to demonstrate an inventory and warehouse management concept, implementing product record creation, viewing, updating, and deletion, along with account registration, login, and manual occupancy updates across 12 warehouse areas</w:t>
+      </w:r>
+      <w:r>
+        <w:rPr>
+          <w:color w:val="auto"/>
+        </w:rPr>
+        <w:t xml:space="preserve">. </w:t>
+      </w:r>
+      <w:hyperlink r:id="rId13" w:history="1">
         <w:r>
           <w:rPr>
             <w:rStyle w:val="Hyperlink"/>
             <w:color w:val="7030A0"/>
           </w:rPr>
-          <w:t>p</w:t>
-        </w:r>
-        <w:r>
-          <w:rPr>
-            <w:rStyle w:val="Hyperlink"/>
-            <w:color w:val="7030A0"/>
-          </w:rPr>
-          <w:t>o</w:t>
-        </w:r>
-        <w:r>
-          <w:rPr>
-            <w:rStyle w:val="Hyperlink"/>
-            <w:color w:val="7030A0"/>
-          </w:rPr>
-          <w:t>si</w:t>
-        </w:r>
-        <w:r>
-          <w:rPr>
-            <w:rStyle w:val="Hyperlink"/>
-            <w:color w:val="7030A0"/>
-          </w:rPr>
-          <w:t>t</w:t>
-        </w:r>
-        <w:r>
-          <w:rPr>
-            <w:rStyle w:val="Hyperlink"/>
-            <w:color w:val="7030A0"/>
-          </w:rPr>
-          <w:t>ory</w:t>
+          <w:t>GitHub Repository</w:t>
         </w:r>
       </w:hyperlink>
     </w:p>
     <w:p>
       <w:pPr>
         <w:pStyle w:val="CVEntry"/>
-        <w:keepNext/>
         <w:keepLines/>
         <w:numPr>
           <w:ilvl w:val="0"/>
           <w:numId w:val="1"/>
         </w:numPr>
-        <w:rPr>
-          <w:color w:val="auto"/>
-        </w:rPr>
-      </w:pPr>
+        <w:jc w:val="both"/>
+        <w:rPr>
+          <w:color w:val="auto"/>
+          <w:lang w:val="en-PH"/>
+        </w:rPr>
+      </w:pPr>
+      <w:proofErr w:type="spellStart"/>
       <w:r>
         <w:rPr>
           <w:b/>
           <w:color w:val="auto"/>
         </w:rPr>
-        <w:t xml:space="preserve">Real-Time </w:t>
-      </w:r>
-      <w:proofErr w:type="spellStart"/>
+        <w:t>AquaFlush</w:t>
+      </w:r>
+      <w:proofErr w:type="spellEnd"/>
       <w:r>
         <w:rPr>
           <w:b/>
           <w:color w:val="auto"/>
         </w:rPr>
-        <w:t>Multisensor</w:t>
-      </w:r>
-      <w:proofErr w:type="spellEnd"/>
+        <w:t>: Arduino Water-Flow Monitoring Prototype</w:t>
+      </w:r>
       <w:r>
         <w:rPr>
           <w:b/>
           <w:color w:val="auto"/>
         </w:rPr>
-        <w:t xml:space="preserve"> Room Monitor</w:t>
-      </w:r>
-      <w:r>
-        <w:rPr>
-          <w:b/>
-          <w:color w:val="auto"/>
-        </w:rPr>
         <w:t xml:space="preserve"> </w:t>
       </w:r>
       <w:r>
         <w:rPr>
           <w:color w:val="auto"/>
         </w:rPr>
-        <w:t>—</w:t>
-      </w:r>
-      <w:r>
-        <w:rPr>
-          <w:color w:val="auto"/>
-        </w:rPr>
-        <w:t xml:space="preserve"> </w:t>
-      </w:r>
-      <w:proofErr w:type="spellStart"/>
-      <w:r>
-        <w:rPr>
-          <w:color w:val="auto"/>
-        </w:rPr>
-        <w:t>FreeRTOS</w:t>
-      </w:r>
-      <w:proofErr w:type="spellEnd"/>
-      <w:r>
-        <w:rPr>
-          <w:color w:val="auto"/>
-        </w:rPr>
-        <w:t xml:space="preserve"> tasks on an STM32 Blue Pill for sensor acquisition, OLED display, rotary-encoder input, motion monitoring, and temperature alarms, coordinated them using queues, event groups, and a serial mutex, and documented 10 functional checks covering sensor updates, navigation, alarms, and activity-state transitions</w:t>
-      </w:r>
-      <w:r>
-        <w:rPr>
-          <w:color w:val="auto"/>
-        </w:rPr>
-        <w:t xml:space="preserve">. </w:t>
-      </w:r>
-      <w:hyperlink r:id="rId11">
-        <w:r>
-          <w:rPr>
-            <w:color w:val="7030A0"/>
-            <w:u w:val="single"/>
-          </w:rPr>
-          <w:t>GitHub r</w:t>
-        </w:r>
-        <w:r>
-          <w:rPr>
-            <w:color w:val="7030A0"/>
-            <w:u w:val="single"/>
-          </w:rPr>
-          <w:t>e</w:t>
-        </w:r>
-        <w:r>
-          <w:rPr>
-            <w:color w:val="7030A0"/>
-            <w:u w:val="single"/>
-          </w:rPr>
-          <w:t>p</w:t>
-        </w:r>
-        <w:r>
-          <w:rPr>
-            <w:color w:val="7030A0"/>
-            <w:u w:val="single"/>
-          </w:rPr>
-          <w:t>o</w:t>
-        </w:r>
-        <w:r>
-          <w:rPr>
-            <w:color w:val="7030A0"/>
-            <w:u w:val="single"/>
-          </w:rPr>
-          <w:t>sitory</w:t>
-        </w:r>
-      </w:hyperlink>
-    </w:p>
-    <w:p>
-      <w:pPr>
-        <w:pStyle w:val="CVEntry"/>
-        <w:keepNext/>
-        <w:keepLines/>
-        <w:numPr>
-          <w:ilvl w:val="0"/>
-          <w:numId w:val="1"/>
-        </w:numPr>
-        <w:rPr>
-          <w:color w:val="auto"/>
-        </w:rPr>
-      </w:pPr>
-      <w:r>
-        <w:rPr>
-          <w:b/>
-          <w:color w:val="auto"/>
-        </w:rPr>
-        <w:t>Smart Inventory Sorting System</w:t>
-      </w:r>
-      <w:r>
-        <w:rPr>
-          <w:b/>
-          <w:color w:val="auto"/>
-        </w:rPr>
-        <w:t xml:space="preserve"> </w:t>
-      </w:r>
-      <w:r>
-        <w:rPr>
-          <w:color w:val="auto"/>
-        </w:rPr>
-        <w:t xml:space="preserve">— </w:t>
-      </w:r>
-      <w:r>
-        <w:rPr>
-          <w:color w:val="auto"/>
-        </w:rPr>
-        <w:t>A</w:t>
-      </w:r>
-      <w:r>
-        <w:rPr>
-          <w:color w:val="auto"/>
-        </w:rPr>
-        <w:t xml:space="preserve"> desktop software prototype using C++17, Qt Widgets, and SQLite to demonstrate an inventory and warehouse management concept, implementing product record creation, viewing, updating, and deletion, along with account registration, login, and manual occupancy updates across 12 warehouse areas</w:t>
-      </w:r>
-      <w:r>
-        <w:rPr>
-          <w:color w:val="auto"/>
-        </w:rPr>
-        <w:t xml:space="preserve">. </w:t>
-      </w:r>
-      <w:hyperlink r:id="rId12" w:history="1">
-        <w:r>
-          <w:rPr>
-            <w:rStyle w:val="Hyperlink"/>
-            <w:color w:val="7030A0"/>
-          </w:rPr>
-          <w:t>GitHub R</w:t>
-        </w:r>
-        <w:r>
-          <w:rPr>
-            <w:rStyle w:val="Hyperlink"/>
-            <w:color w:val="7030A0"/>
-          </w:rPr>
-          <w:t>e</w:t>
-        </w:r>
-        <w:r>
-          <w:rPr>
-            <w:rStyle w:val="Hyperlink"/>
-            <w:color w:val="7030A0"/>
-          </w:rPr>
-          <w:t>pository</w:t>
-        </w:r>
-      </w:hyperlink>
-    </w:p>
-    <w:p>
-      <w:pPr>
-        <w:pStyle w:val="CVEntry"/>
-        <w:keepNext/>
-        <w:keepLines/>
-        <w:numPr>
-          <w:ilvl w:val="0"/>
-          <w:numId w:val="1"/>
-        </w:numPr>
-        <w:rPr>
-          <w:color w:val="auto"/>
-          <w:lang w:val="en-PH"/>
-        </w:rPr>
-      </w:pPr>
-      <w:proofErr w:type="spellStart"/>
-      <w:r>
-        <w:rPr>
-          <w:b/>
-          <w:color w:val="auto"/>
-        </w:rPr>
-        <w:t>AquaFlush</w:t>
-      </w:r>
-      <w:proofErr w:type="spellEnd"/>
-      <w:r>
-        <w:rPr>
-          <w:b/>
-          <w:color w:val="auto"/>
-        </w:rPr>
-        <w:t>: Arduino Water-Flow Monitoring Prototype</w:t>
-      </w:r>
-      <w:r>
-        <w:rPr>
-          <w:b/>
-          <w:color w:val="auto"/>
-        </w:rPr>
-        <w:t xml:space="preserve"> </w:t>
-      </w:r>
-      <w:r>
-        <w:rPr>
-          <w:color w:val="auto"/>
-        </w:rPr>
         <w:t>— Programmed an Arduino Uno to estimate water-flow rates using interrupt-based sensor pulse counting, wired electronic components, and collaborated on constructing a miniature drainage model for demonstration.</w:t>
-      </w:r>
-      <w:r>
-        <w:rPr>
-          <w:color w:val="auto"/>
-          <w:lang w:val="en-PH"/>
-        </w:rPr>
-        <w:t xml:space="preserve"> </w:t>
-      </w:r>
-      <w:hyperlink r:id="rId13" w:history="1">
-        <w:r>
-          <w:rPr>
-            <w:rStyle w:val="Hyperlink"/>
-            <w:color w:val="7030A0"/>
-            <w:lang w:val="en-PH"/>
-          </w:rPr>
-          <w:t xml:space="preserve">GitHub </w:t>
-        </w:r>
-        <w:r>
-          <w:rPr>
-            <w:rStyle w:val="Hyperlink"/>
-            <w:color w:val="7030A0"/>
-            <w:lang w:val="en-PH"/>
-          </w:rPr>
-          <w:t>R</w:t>
-        </w:r>
-        <w:r>
-          <w:rPr>
-            <w:rStyle w:val="Hyperlink"/>
-            <w:color w:val="7030A0"/>
-            <w:lang w:val="en-PH"/>
-          </w:rPr>
-          <w:t>ep</w:t>
-        </w:r>
-        <w:r>
-          <w:rPr>
-            <w:rStyle w:val="Hyperlink"/>
-            <w:color w:val="7030A0"/>
-            <w:lang w:val="en-PH"/>
-          </w:rPr>
-          <w:t>o</w:t>
-        </w:r>
-        <w:r>
-          <w:rPr>
-            <w:rStyle w:val="Hyperlink"/>
-            <w:color w:val="7030A0"/>
-            <w:lang w:val="en-PH"/>
-          </w:rPr>
-          <w:t>sit</w:t>
-        </w:r>
-        <w:r>
-          <w:rPr>
-            <w:rStyle w:val="Hyperlink"/>
-            <w:color w:val="7030A0"/>
-            <w:lang w:val="en-PH"/>
-          </w:rPr>
-          <w:t>o</w:t>
-        </w:r>
-        <w:r>
-          <w:rPr>
-            <w:rStyle w:val="Hyperlink"/>
-            <w:color w:val="7030A0"/>
-            <w:lang w:val="en-PH"/>
-          </w:rPr>
-          <w:t>ry</w:t>
-        </w:r>
-      </w:hyperlink>
-    </w:p>
-    <w:p>
-      <w:pPr>
-        <w:pStyle w:val="CVEntry"/>
-        <w:keepNext/>
-        <w:keepLines/>
-        <w:numPr>
-          <w:ilvl w:val="0"/>
-          <w:numId w:val="1"/>
-        </w:numPr>
-        <w:rPr>
-          <w:color w:val="auto"/>
-        </w:rPr>
-      </w:pPr>
-      <w:r>
-        <w:rPr>
-          <w:b/>
-          <w:color w:val="auto"/>
-        </w:rPr>
-        <w:t>Industrial Drying Oven Control Using PLC and HMI</w:t>
-      </w:r>
-      <w:r>
-        <w:rPr>
-          <w:b/>
-          <w:color w:val="auto"/>
-        </w:rPr>
-        <w:t xml:space="preserve"> </w:t>
-      </w:r>
-      <w:r>
-        <w:rPr>
-          <w:color w:val="auto"/>
-        </w:rPr>
-        <w:t>— Designed and simulated a drying oven control system for metal fixtures containing heat-sensitive rubber O-rings, integrating PLC logic and HMI screens in CODESYS for temperature regulation and operational monitoring with adjustable temperature settings, door interlocks, status indicators, overtemperature alarms, and automatic shutdown logic.</w:t>
       </w:r>
       <w:r>
         <w:rPr>
@@ -1012,51 +796,70 @@
             <w:color w:val="7030A0"/>
             <w:lang w:val="en-PH"/>
           </w:rPr>
-          <w:t>Googl</w:t>
+          <w:t>GitHub Repository</w:t>
         </w:r>
+      </w:hyperlink>
+    </w:p>
+    <w:p>
+      <w:pPr>
+        <w:pStyle w:val="CVEntry"/>
+        <w:keepLines/>
+        <w:numPr>
+          <w:ilvl w:val="0"/>
+          <w:numId w:val="1"/>
+        </w:numPr>
+        <w:jc w:val="both"/>
+        <w:rPr>
+          <w:color w:val="auto"/>
+        </w:rPr>
+      </w:pPr>
+      <w:r>
+        <w:rPr>
+          <w:b/>
+          <w:color w:val="auto"/>
+        </w:rPr>
+        <w:t>Industrial Drying Oven Control Using PLC and HMI</w:t>
+      </w:r>
+      <w:r>
+        <w:rPr>
+          <w:b/>
+          <w:color w:val="auto"/>
+        </w:rPr>
+        <w:t xml:space="preserve"> </w:t>
+      </w:r>
+      <w:r>
+        <w:rPr>
+          <w:color w:val="auto"/>
+        </w:rPr>
+        <w:t>— Designed and simulated a drying oven control system for metal fixtures containing heat-sensitive rubber O-rings, integrating PLC logic and HMI screens in CODESYS for temperature regulation and operational monitoring with adjustable temperature settings, door interlocks, status indicators, overtemperature alarms, and automatic shutdown logic.</w:t>
+      </w:r>
+      <w:r>
+        <w:rPr>
+          <w:color w:val="auto"/>
+          <w:lang w:val="en-PH"/>
+        </w:rPr>
+        <w:t xml:space="preserve"> </w:t>
+      </w:r>
+      <w:hyperlink r:id="rId15" w:history="1">
         <w:r>
           <w:rPr>
             <w:rStyle w:val="Hyperlink"/>
             <w:color w:val="7030A0"/>
             <w:lang w:val="en-PH"/>
           </w:rPr>
-          <w:t>e</w:t>
-        </w:r>
-        <w:r>
-          <w:rPr>
-            <w:rStyle w:val="Hyperlink"/>
-            <w:color w:val="7030A0"/>
-            <w:lang w:val="en-PH"/>
-          </w:rPr>
-          <w:t xml:space="preserve"> </w:t>
-        </w:r>
-        <w:r>
-          <w:rPr>
-            <w:rStyle w:val="Hyperlink"/>
-            <w:color w:val="7030A0"/>
-            <w:lang w:val="en-PH"/>
-          </w:rPr>
-          <w:t>Sit</w:t>
-        </w:r>
-        <w:r>
-          <w:rPr>
-            <w:rStyle w:val="Hyperlink"/>
-            <w:color w:val="7030A0"/>
-            <w:lang w:val="en-PH"/>
-          </w:rPr>
-          <w:t>e</w:t>
+          <w:t>Google Site</w:t>
         </w:r>
       </w:hyperlink>
     </w:p>
     <w:p>
       <w:pPr>
         <w:pStyle w:val="CVEntry"/>
-        <w:keepNext/>
         <w:keepLines/>
         <w:numPr>
           <w:ilvl w:val="0"/>
           <w:numId w:val="1"/>
         </w:numPr>
+        <w:jc w:val="both"/>
         <w:rPr>
           <w:color w:val="auto"/>
         </w:rPr>
@@ -1094,92 +897,6 @@
           <w:color w:val="auto"/>
         </w:rPr>
         <w:t>Prototyped the circuit on a breadboard, soldered components onto a PCB, created 3D models and an animation using Autodesk Fusion 360, and conducted 50 trials across five potentiometer settings to evaluate LED output distribution and circuit behavior.</w:t>
-      </w:r>
-      <w:r>
-        <w:rPr>
-          <w:color w:val="auto"/>
-        </w:rPr>
-        <w:t xml:space="preserve"> </w:t>
-      </w:r>
-      <w:hyperlink r:id="rId15" w:history="1">
-        <w:r>
-          <w:rPr>
-            <w:rStyle w:val="Hyperlink"/>
-            <w:color w:val="7030A0"/>
-          </w:rPr>
-          <w:t>Google</w:t>
-        </w:r>
-        <w:r>
-          <w:rPr>
-            <w:rStyle w:val="Hyperlink"/>
-            <w:color w:val="7030A0"/>
-          </w:rPr>
-          <w:t xml:space="preserve"> </w:t>
-        </w:r>
-        <w:r>
-          <w:rPr>
-            <w:rStyle w:val="Hyperlink"/>
-            <w:color w:val="7030A0"/>
-          </w:rPr>
-          <w:t>D</w:t>
-        </w:r>
-        <w:r>
-          <w:rPr>
-            <w:rStyle w:val="Hyperlink"/>
-            <w:color w:val="7030A0"/>
-          </w:rPr>
-          <w:t>rive</w:t>
-        </w:r>
-      </w:hyperlink>
-    </w:p>
-    <w:p>
-      <w:pPr>
-        <w:pStyle w:val="CVEntry"/>
-        <w:keepNext/>
-        <w:keepLines/>
-        <w:numPr>
-          <w:ilvl w:val="0"/>
-          <w:numId w:val="1"/>
-        </w:numPr>
-        <w:rPr>
-          <w:b/>
-          <w:bCs/>
-          <w:color w:val="auto"/>
-        </w:rPr>
-      </w:pPr>
-      <w:r>
-        <w:rPr>
-          <w:b/>
-          <w:bCs/>
-          <w:color w:val="auto"/>
-        </w:rPr>
-        <w:t>Line Following Robot using Arduino ATMega328P</w:t>
-      </w:r>
-      <w:r>
-        <w:rPr>
-          <w:b/>
-          <w:bCs/>
-          <w:color w:val="auto"/>
-        </w:rPr>
-        <w:t xml:space="preserve"> </w:t>
-      </w:r>
-      <w:r>
-        <w:rPr>
-          <w:color w:val="auto"/>
-        </w:rPr>
-        <w:t>—</w:t>
-      </w:r>
-      <w:r>
-        <w:rPr>
-          <w:color w:val="auto"/>
-        </w:rPr>
-        <w:t xml:space="preserve"> Built </w:t>
-      </w:r>
-      <w:r>
-        <w:rPr>
-          <w:color w:val="auto"/>
-        </w:rPr>
-        <w:t>and documented the hardware for an Arduino Uno (ATmega328P) line-following robot, integrating two infrared sensors, an L298N motor driver, and DC motors for autonomous line tracking.</w:t>
       </w:r>
       <w:r>
         <w:rPr>
@@ -1193,40 +910,85 @@
             <w:rStyle w:val="Hyperlink"/>
             <w:color w:val="7030A0"/>
           </w:rPr>
-          <w:t xml:space="preserve">Google </w:t>
+          <w:t>Google Drive</w:t>
         </w:r>
+      </w:hyperlink>
+    </w:p>
+    <w:p>
+      <w:pPr>
+        <w:pStyle w:val="CVEntry"/>
+        <w:keepLines/>
+        <w:numPr>
+          <w:ilvl w:val="0"/>
+          <w:numId w:val="1"/>
+        </w:numPr>
+        <w:jc w:val="both"/>
+        <w:rPr>
+          <w:b/>
+          <w:bCs/>
+          <w:color w:val="auto"/>
+        </w:rPr>
+      </w:pPr>
+      <w:r>
+        <w:rPr>
+          <w:b/>
+          <w:bCs/>
+          <w:color w:val="auto"/>
+        </w:rPr>
+        <w:lastRenderedPageBreak/>
+        <w:t>Line Following Robot using Arduino ATMega328P</w:t>
+      </w:r>
+      <w:r>
+        <w:rPr>
+          <w:b/>
+          <w:bCs/>
+          <w:color w:val="auto"/>
+        </w:rPr>
+        <w:t xml:space="preserve"> </w:t>
+      </w:r>
+      <w:r>
+        <w:rPr>
+          <w:color w:val="auto"/>
+        </w:rPr>
+        <w:t>—</w:t>
+      </w:r>
+      <w:r>
+        <w:rPr>
+          <w:color w:val="auto"/>
+        </w:rPr>
+        <w:t xml:space="preserve"> Built </w:t>
+      </w:r>
+      <w:r>
+        <w:rPr>
+          <w:color w:val="auto"/>
+        </w:rPr>
+        <w:t>and documented the hardware for an Arduino Uno (ATmega328P) line-following robot, integrating two infrared sensors, an L298N motor driver, and DC motors for autonomous line tracking.</w:t>
+      </w:r>
+      <w:r>
+        <w:rPr>
+          <w:color w:val="auto"/>
+        </w:rPr>
+        <w:t xml:space="preserve"> </w:t>
+      </w:r>
+      <w:hyperlink r:id="rId17" w:history="1">
         <w:r>
           <w:rPr>
             <w:rStyle w:val="Hyperlink"/>
             <w:color w:val="7030A0"/>
           </w:rPr>
-          <w:t>D</w:t>
-        </w:r>
-        <w:r>
-          <w:rPr>
-            <w:rStyle w:val="Hyperlink"/>
-            <w:color w:val="7030A0"/>
-          </w:rPr>
-          <w:t>r</w:t>
-        </w:r>
-        <w:r>
-          <w:rPr>
-            <w:rStyle w:val="Hyperlink"/>
-            <w:color w:val="7030A0"/>
-          </w:rPr>
-          <w:t>ive</w:t>
+          <w:t>Google Drive</w:t>
         </w:r>
       </w:hyperlink>
     </w:p>
     <w:p>
       <w:pPr>
         <w:pStyle w:val="CVEntry"/>
-        <w:keepNext/>
         <w:keepLines/>
         <w:numPr>
           <w:ilvl w:val="0"/>
           <w:numId w:val="1"/>
         </w:numPr>
+        <w:jc w:val="both"/>
         <w:rPr>
           <w:b/>
           <w:bCs/>
@@ -1273,7 +1035,7 @@
         </w:rPr>
         <w:t xml:space="preserve">). </w:t>
       </w:r>
-      <w:hyperlink r:id="rId17" w:history="1">
+      <w:hyperlink r:id="rId18" w:history="1">
         <w:r>
           <w:rPr>
             <w:rStyle w:val="Hyperlink"/>
@@ -1285,752 +1047,172 @@
     </w:p>
     <w:p>
       <w:pPr>
-        <w:pStyle w:val="Heading1"/>
-        <w:pageBreakBefore/>
-        <w:spacing w:before="0"/>
-        <w:rPr>
-          <w:color w:val="auto"/>
-        </w:rPr>
-      </w:pPr>
-      <w:r>
-        <w:rPr>
-          <w:color w:val="auto"/>
-        </w:rPr>
-        <w:lastRenderedPageBreak/>
-        <w:t>Honors and Awards</w:t>
-      </w:r>
+        <w:pStyle w:val="ListBullet"/>
+        <w:jc w:val="both"/>
+        <w:rPr>
+          <w:lang w:val="en-PH"/>
+        </w:rPr>
+      </w:pPr>
+      <w:proofErr w:type="spellStart"/>
+      <w:r>
+        <w:rPr>
+          <w:rStyle w:val="Strong"/>
+        </w:rPr>
+        <w:t>BrainBoard</w:t>
+      </w:r>
+      <w:proofErr w:type="spellEnd"/>
+      <w:r>
+        <w:rPr>
+          <w:rStyle w:val="Strong"/>
+        </w:rPr>
+        <w:t xml:space="preserve"> Quiz Game </w:t>
+      </w:r>
+      <w:r>
+        <w:rPr>
+          <w:color w:val="auto"/>
+        </w:rPr>
+        <w:t>—</w:t>
+      </w:r>
+      <w:r>
+        <w:rPr>
+          <w:lang w:val="en-PH"/>
+        </w:rPr>
+        <w:t xml:space="preserve"> </w:t>
+      </w:r>
+      <w:r>
+        <w:rPr>
+          <w:lang w:val="en-PH"/>
+        </w:rPr>
+        <w:t xml:space="preserve">RT-Thread and LVGL on the RA6M3, </w:t>
+      </w:r>
+      <w:proofErr w:type="spellStart"/>
+      <w:r>
+        <w:rPr>
+          <w:lang w:val="en-PH"/>
+        </w:rPr>
+        <w:t>BrainBoard</w:t>
+      </w:r>
+      <w:proofErr w:type="spellEnd"/>
+      <w:r>
+        <w:rPr>
+          <w:lang w:val="en-PH"/>
+        </w:rPr>
+        <w:t xml:space="preserve"> combines touchscreen quizzes, live scoring, and time tracking to test how quickly you can think.</w:t>
+      </w:r>
+      <w:r>
+        <w:rPr>
+          <w:lang w:val="en-PH"/>
+        </w:rPr>
+        <w:t xml:space="preserve"> </w:t>
+      </w:r>
+      <w:hyperlink r:id="rId19" w:history="1">
+        <w:r>
+          <w:rPr>
+            <w:rStyle w:val="Hyperlink"/>
+            <w:color w:val="7030A0"/>
+            <w:lang w:val="en-PH"/>
+          </w:rPr>
+          <w:t>Project</w:t>
+        </w:r>
+      </w:hyperlink>
     </w:p>
     <w:p>
       <w:pPr>
-        <w:pStyle w:val="CVEntry"/>
-        <w:keepNext/>
-        <w:keepLines/>
+        <w:pStyle w:val="ListBullet"/>
+        <w:jc w:val="both"/>
+        <w:rPr>
+          <w:lang w:val="en-PH"/>
+        </w:rPr>
+      </w:pPr>
+      <w:r>
+        <w:rPr>
+          <w:rStyle w:val="Strong"/>
+        </w:rPr>
+        <w:t xml:space="preserve">STM32 </w:t>
+      </w:r>
+      <w:proofErr w:type="spellStart"/>
+      <w:r>
+        <w:rPr>
+          <w:rStyle w:val="Strong"/>
+        </w:rPr>
+        <w:t>FreeRTOS</w:t>
+      </w:r>
+      <w:proofErr w:type="spellEnd"/>
+      <w:r>
+        <w:rPr>
+          <w:rStyle w:val="Strong"/>
+        </w:rPr>
+        <w:t xml:space="preserve"> Audio Player  </w:t>
+      </w:r>
+      <w:r>
+        <w:rPr>
+          <w:color w:val="auto"/>
+        </w:rPr>
+        <w:t>—</w:t>
+      </w:r>
+      <w:r>
+        <w:rPr>
+          <w:color w:val="auto"/>
+        </w:rPr>
+        <w:t xml:space="preserve"> </w:t>
+      </w:r>
+      <w:r>
+        <w:rPr>
+          <w:lang w:val="en-PH"/>
+        </w:rPr>
+        <w:t xml:space="preserve">An STM32F407 audio player that turns binary song selections into synthesized melodies using I2S and DMA while </w:t>
+      </w:r>
+      <w:proofErr w:type="spellStart"/>
+      <w:r>
+        <w:rPr>
+          <w:lang w:val="en-PH"/>
+        </w:rPr>
+        <w:t>FreeRTOS</w:t>
+      </w:r>
+      <w:proofErr w:type="spellEnd"/>
+      <w:r>
+        <w:rPr>
+          <w:lang w:val="en-PH"/>
+        </w:rPr>
+        <w:t xml:space="preserve"> keeps playback controls responsive. </w:t>
+      </w:r>
+      <w:hyperlink r:id="rId20" w:history="1">
+        <w:r>
+          <w:rPr>
+            <w:rStyle w:val="Hyperlink"/>
+            <w:color w:val="7030A0"/>
+          </w:rPr>
+          <w:t>GitHub Repository</w:t>
+        </w:r>
+      </w:hyperlink>
+    </w:p>
+    <w:p>
+      <w:pPr>
+        <w:pStyle w:val="ListBullet"/>
         <w:numPr>
           <w:ilvl w:val="0"/>
-          <w:numId w:val="1"/>
+          <w:numId w:val="0"/>
         </w:numPr>
-        <w:rPr>
-          <w:color w:val="auto"/>
-        </w:rPr>
-      </w:pPr>
-      <w:r>
-        <w:rPr>
-          <w:b/>
-          <w:color w:val="auto"/>
-        </w:rPr>
-        <w:t>Champion — Best in Pitching; 1st Runner-Up — Best in Innovative System</w:t>
-      </w:r>
-      <w:r>
-        <w:rPr>
-          <w:color w:val="auto"/>
-        </w:rPr>
-        <w:t xml:space="preserve"> — TechShowcase 2025: Innovations in Application Development and Emerging Technologies (December 2025)</w:t>
-      </w:r>
+        <w:jc w:val="both"/>
+        <w:rPr>
+          <w:lang w:val="en-PH"/>
+        </w:rPr>
+      </w:pPr>
     </w:p>
     <w:p>
       <w:pPr>
-        <w:pStyle w:val="CVEntry"/>
-        <w:keepNext/>
-        <w:keepLines/>
-        <w:numPr>
-          <w:ilvl w:val="0"/>
-          <w:numId w:val="1"/>
-        </w:numPr>
-        <w:rPr>
-          <w:color w:val="auto"/>
-        </w:rPr>
-      </w:pPr>
-      <w:r>
-        <w:rPr>
-          <w:b/>
-          <w:color w:val="auto"/>
-        </w:rPr>
-        <w:t>Certificate of Commendation</w:t>
-      </w:r>
-      <w:r>
-        <w:rPr>
-          <w:color w:val="auto"/>
-        </w:rPr>
-        <w:t xml:space="preserve"> — </w:t>
-      </w:r>
-      <w:r>
-        <w:rPr>
-          <w:color w:val="auto"/>
-        </w:rPr>
-        <w:t>Computer Applications</w:t>
-      </w:r>
-      <w:r>
-        <w:rPr>
-          <w:color w:val="auto"/>
-        </w:rPr>
-        <w:t xml:space="preserve">, </w:t>
-      </w:r>
-      <w:r>
-        <w:rPr>
-          <w:color w:val="auto"/>
-        </w:rPr>
-        <w:t xml:space="preserve">CCC102 Computer Programming 2, </w:t>
-      </w:r>
-      <w:r>
-        <w:rPr>
-          <w:color w:val="auto"/>
-        </w:rPr>
-        <w:t>MSU</w:t>
-      </w:r>
-      <w:r>
-        <w:rPr>
-          <w:color w:val="auto"/>
-        </w:rPr>
-        <w:t>-</w:t>
-      </w:r>
-      <w:r>
-        <w:rPr>
-          <w:color w:val="auto"/>
-        </w:rPr>
-        <w:t>IIT (March 2025)</w:t>
-      </w:r>
-    </w:p>
-    <w:p>
-      <w:pPr>
-        <w:pStyle w:val="CVEntry"/>
-        <w:keepNext/>
-        <w:keepLines/>
-        <w:numPr>
-          <w:ilvl w:val="0"/>
-          <w:numId w:val="1"/>
-        </w:numPr>
-        <w:rPr>
-          <w:color w:val="auto"/>
-        </w:rPr>
-      </w:pPr>
-      <w:r>
-        <w:rPr>
-          <w:b/>
-          <w:color w:val="auto"/>
-        </w:rPr>
-        <w:t>Grand Prize Winner</w:t>
-      </w:r>
-      <w:r>
-        <w:rPr>
-          <w:color w:val="auto"/>
-        </w:rPr>
-        <w:t xml:space="preserve"> — Sustainable Innovation Pitch Competition (September 2024)</w:t>
-      </w:r>
-      <w:r>
-        <w:rPr>
-          <w:color w:val="auto"/>
-        </w:rPr>
-        <w:t xml:space="preserve"> </w:t>
-      </w:r>
-    </w:p>
-    <w:p>
-      <w:pPr>
         <w:pStyle w:val="Heading1"/>
-        <w:rPr>
-          <w:color w:val="auto"/>
-        </w:rPr>
-      </w:pPr>
-      <w:r>
-        <w:rPr>
-          <w:color w:val="auto"/>
-        </w:rPr>
-        <w:t>Leadership and Activities</w:t>
-      </w:r>
-      <w:r>
-        <w:rPr>
-          <w:color w:val="auto"/>
-        </w:rPr>
-        <w:t xml:space="preserve"> </w:t>
-      </w:r>
-    </w:p>
-    <w:p>
-      <w:pPr>
-        <w:pStyle w:val="CVEntry"/>
-        <w:keepNext/>
-        <w:keepLines/>
-        <w:numPr>
-          <w:ilvl w:val="0"/>
-          <w:numId w:val="1"/>
-        </w:numPr>
-        <w:rPr>
-          <w:color w:val="auto"/>
-        </w:rPr>
-      </w:pPr>
-      <w:r>
-        <w:rPr>
-          <w:b/>
-          <w:color w:val="auto"/>
-        </w:rPr>
-        <w:t>Legislative Secretary, Administrative Committee</w:t>
-      </w:r>
-      <w:r>
-        <w:rPr>
-          <w:color w:val="auto"/>
-        </w:rPr>
-        <w:t xml:space="preserve"> </w:t>
-      </w:r>
-      <w:r>
-        <w:rPr>
-          <w:color w:val="auto"/>
-        </w:rPr>
-        <w:t>—</w:t>
-      </w:r>
-      <w:r>
-        <w:rPr>
-          <w:color w:val="auto"/>
-        </w:rPr>
-        <w:t xml:space="preserve"> College of Computer Studies Student Council, MSU-IIT </w:t>
-      </w:r>
-      <w:r>
-        <w:rPr>
-          <w:color w:val="auto"/>
-        </w:rPr>
-        <w:t>(2026 – Present)</w:t>
-      </w:r>
-      <w:r>
-        <w:rPr>
-          <w:color w:val="auto"/>
-        </w:rPr>
-        <w:t xml:space="preserve"> </w:t>
-      </w:r>
-    </w:p>
-    <w:p>
-      <w:pPr>
-        <w:pStyle w:val="CVEntry"/>
-        <w:keepNext/>
-        <w:keepLines/>
-        <w:numPr>
-          <w:ilvl w:val="0"/>
-          <w:numId w:val="1"/>
-        </w:numPr>
-        <w:rPr>
-          <w:color w:val="auto"/>
-        </w:rPr>
-      </w:pPr>
-      <w:r>
-        <w:rPr>
-          <w:b/>
-          <w:color w:val="auto"/>
-        </w:rPr>
-        <w:t>Co-Chairperson, Ways and Means Committee</w:t>
-      </w:r>
-      <w:r>
-        <w:rPr>
-          <w:b/>
-          <w:color w:val="auto"/>
-        </w:rPr>
-        <w:t xml:space="preserve"> </w:t>
-      </w:r>
-      <w:r>
-        <w:rPr>
-          <w:color w:val="auto"/>
-        </w:rPr>
-        <w:t>—</w:t>
-      </w:r>
-      <w:r>
-        <w:rPr>
-          <w:color w:val="auto"/>
-        </w:rPr>
-        <w:t xml:space="preserve"> </w:t>
-      </w:r>
-      <w:r>
-        <w:rPr>
-          <w:color w:val="auto"/>
-        </w:rPr>
-        <w:t>College of Computer Studies Student Council, MSU-IIT</w:t>
-      </w:r>
-      <w:r>
-        <w:rPr>
-          <w:color w:val="auto"/>
-        </w:rPr>
-        <w:t xml:space="preserve"> (2025 – 2026)</w:t>
-      </w:r>
-    </w:p>
-    <w:p>
-      <w:pPr>
-        <w:pStyle w:val="CVEntry"/>
-        <w:keepNext/>
-        <w:keepLines/>
-        <w:numPr>
-          <w:ilvl w:val="0"/>
-          <w:numId w:val="1"/>
-        </w:numPr>
-        <w:rPr>
-          <w:color w:val="auto"/>
-        </w:rPr>
-      </w:pPr>
-      <w:r>
-        <w:rPr>
-          <w:b/>
-          <w:color w:val="auto"/>
-        </w:rPr>
-        <w:t>Secretary, Special Events Committee</w:t>
-      </w:r>
-      <w:r>
-        <w:rPr>
-          <w:b/>
-          <w:color w:val="auto"/>
-        </w:rPr>
-        <w:t xml:space="preserve"> </w:t>
-      </w:r>
-      <w:r>
-        <w:rPr>
-          <w:color w:val="auto"/>
-        </w:rPr>
-        <w:t>—</w:t>
-      </w:r>
-      <w:r>
-        <w:rPr>
-          <w:color w:val="auto"/>
-        </w:rPr>
-        <w:t xml:space="preserve"> </w:t>
-      </w:r>
-      <w:r>
-        <w:rPr>
-          <w:color w:val="auto"/>
-        </w:rPr>
-        <w:t>College of Computer Studies Student Council, MSU-IIT</w:t>
-      </w:r>
-      <w:r>
-        <w:rPr>
-          <w:color w:val="auto"/>
-        </w:rPr>
-        <w:t xml:space="preserve"> (2024 – 2025)</w:t>
-      </w:r>
-    </w:p>
-    <w:p>
-      <w:pPr>
-        <w:pStyle w:val="CVEntry"/>
-        <w:keepNext/>
-        <w:keepLines/>
-        <w:numPr>
-          <w:ilvl w:val="0"/>
-          <w:numId w:val="1"/>
-        </w:numPr>
-        <w:rPr>
-          <w:color w:val="auto"/>
-        </w:rPr>
-      </w:pPr>
-      <w:r>
-        <w:rPr>
-          <w:b/>
-          <w:color w:val="auto"/>
-        </w:rPr>
-        <w:t>Unders</w:t>
-      </w:r>
-      <w:r>
-        <w:rPr>
-          <w:b/>
-          <w:color w:val="auto"/>
-        </w:rPr>
-        <w:t xml:space="preserve">ecretary, </w:t>
-      </w:r>
-      <w:r>
-        <w:rPr>
-          <w:b/>
-          <w:color w:val="auto"/>
-        </w:rPr>
-        <w:t>Computer Applications Society</w:t>
-      </w:r>
-      <w:r>
-        <w:rPr>
-          <w:b/>
-          <w:color w:val="auto"/>
-        </w:rPr>
-        <w:t xml:space="preserve"> </w:t>
-      </w:r>
-      <w:r>
-        <w:rPr>
-          <w:color w:val="auto"/>
-        </w:rPr>
-        <w:t>— College of Computer Studies, MSU-IIT (202</w:t>
-      </w:r>
-      <w:r>
-        <w:rPr>
-          <w:color w:val="auto"/>
-        </w:rPr>
-        <w:t>3</w:t>
-      </w:r>
-      <w:r>
-        <w:rPr>
-          <w:color w:val="auto"/>
-        </w:rPr>
-        <w:t>– 202</w:t>
-      </w:r>
-      <w:r>
-        <w:rPr>
-          <w:color w:val="auto"/>
-        </w:rPr>
-        <w:t>4</w:t>
-      </w:r>
-      <w:r>
-        <w:rPr>
-          <w:color w:val="auto"/>
-        </w:rPr>
-        <w:t>)</w:t>
-      </w:r>
-    </w:p>
-    <w:p>
-      <w:pPr>
-        <w:pStyle w:val="CVEntry"/>
-        <w:keepNext/>
-        <w:keepLines/>
-        <w:numPr>
-          <w:ilvl w:val="0"/>
-          <w:numId w:val="1"/>
-        </w:numPr>
-        <w:rPr>
-          <w:color w:val="auto"/>
-        </w:rPr>
-      </w:pPr>
-      <w:r>
-        <w:rPr>
-          <w:b/>
-          <w:color w:val="auto"/>
-        </w:rPr>
-        <w:t>Lead, Program and Technical Committee</w:t>
-      </w:r>
-      <w:r>
-        <w:rPr>
-          <w:color w:val="auto"/>
-        </w:rPr>
-        <w:t xml:space="preserve"> — </w:t>
-      </w:r>
-      <w:proofErr w:type="gramStart"/>
-      <w:r>
-        <w:rPr>
-          <w:color w:val="auto"/>
-        </w:rPr>
-        <w:t>my.ComApps</w:t>
-      </w:r>
-      <w:proofErr w:type="gramEnd"/>
-      <w:r>
-        <w:rPr>
-          <w:color w:val="auto"/>
-        </w:rPr>
-        <w:t xml:space="preserve"> Technology Symposium and Exhibit, MSU-IIT (November 2025)</w:t>
-      </w:r>
-    </w:p>
-    <w:p>
-      <w:pPr>
-        <w:pStyle w:val="CVEntry"/>
-        <w:keepNext/>
-        <w:keepLines/>
-        <w:numPr>
-          <w:ilvl w:val="0"/>
-          <w:numId w:val="1"/>
-        </w:numPr>
-        <w:rPr>
-          <w:color w:val="auto"/>
-        </w:rPr>
-      </w:pPr>
-      <w:r>
-        <w:rPr>
-          <w:b/>
-          <w:color w:val="auto"/>
-        </w:rPr>
-        <w:t>Co-Lead, Sponsorship Team</w:t>
-      </w:r>
-      <w:r>
-        <w:rPr>
-          <w:color w:val="auto"/>
-        </w:rPr>
-        <w:t xml:space="preserve"> — Iligan Campus DEVCON 2025 (October 2025)</w:t>
-      </w:r>
-    </w:p>
-    <w:p>
-      <w:pPr>
-        <w:pStyle w:val="CVEntry"/>
-        <w:keepNext/>
-        <w:keepLines/>
-        <w:numPr>
-          <w:ilvl w:val="0"/>
-          <w:numId w:val="1"/>
-        </w:numPr>
-        <w:rPr>
-          <w:color w:val="auto"/>
-        </w:rPr>
-      </w:pPr>
-      <w:r>
-        <w:rPr>
-          <w:b/>
-          <w:color w:val="auto"/>
-        </w:rPr>
-        <w:t>Event Organizer</w:t>
-      </w:r>
-      <w:r>
-        <w:rPr>
-          <w:color w:val="auto"/>
-        </w:rPr>
-        <w:t xml:space="preserve"> — IEEE Smart Mobility Hackathon, MSU-IIT (September 2025)</w:t>
-      </w:r>
-    </w:p>
-    <w:p>
-      <w:pPr>
-        <w:pStyle w:val="CVEntry"/>
-        <w:keepNext/>
-        <w:keepLines/>
-        <w:numPr>
-          <w:ilvl w:val="0"/>
-          <w:numId w:val="1"/>
-        </w:numPr>
-        <w:rPr>
-          <w:color w:val="auto"/>
-        </w:rPr>
-      </w:pPr>
-      <w:r>
-        <w:rPr>
-          <w:b/>
-          <w:color w:val="auto"/>
-        </w:rPr>
-        <w:t>Lead, Registration Committee</w:t>
-      </w:r>
-      <w:r>
-        <w:rPr>
-          <w:color w:val="auto"/>
-        </w:rPr>
-        <w:t xml:space="preserve"> — </w:t>
-      </w:r>
-      <w:proofErr w:type="spellStart"/>
-      <w:proofErr w:type="gramStart"/>
-      <w:r>
-        <w:rPr>
-          <w:color w:val="auto"/>
-        </w:rPr>
-        <w:t>my.ComApps</w:t>
-      </w:r>
-      <w:proofErr w:type="spellEnd"/>
-      <w:proofErr w:type="gramEnd"/>
-      <w:r>
-        <w:rPr>
-          <w:color w:val="auto"/>
-        </w:rPr>
-        <w:t xml:space="preserve"> - </w:t>
-      </w:r>
-      <w:r>
-        <w:rPr>
-          <w:color w:val="auto"/>
-        </w:rPr>
-        <w:t>A Technology Development Program, MSU-IIT (December 2024)</w:t>
-      </w:r>
-    </w:p>
-    <w:p>
-      <w:pPr>
-        <w:pStyle w:val="Heading1"/>
-        <w:rPr>
-          <w:color w:val="auto"/>
-        </w:rPr>
-      </w:pPr>
-      <w:r>
-        <w:rPr>
-          <w:color w:val="auto"/>
-        </w:rPr>
-        <w:t>Certifications and Training</w:t>
-      </w:r>
-    </w:p>
-    <w:p>
-      <w:pPr>
-        <w:pStyle w:val="ListBullet"/>
-        <w:rPr>
-          <w:color w:val="auto"/>
-        </w:rPr>
-      </w:pPr>
-      <w:r>
-        <w:rPr>
-          <w:rStyle w:val="Strong"/>
-          <w:color w:val="auto"/>
-        </w:rPr>
-        <w:t>AI Career Readiness Training</w:t>
-      </w:r>
-      <w:r>
-        <w:rPr>
-          <w:color w:val="auto"/>
-        </w:rPr>
-        <w:t xml:space="preserve"> — ASEAN Foundation (October 2026)</w:t>
-      </w:r>
-    </w:p>
-    <w:p>
-      <w:pPr>
-        <w:pStyle w:val="ListBullet"/>
-        <w:rPr>
-          <w:color w:val="auto"/>
-        </w:rPr>
-      </w:pPr>
-      <w:r>
-        <w:rPr>
-          <w:rStyle w:val="Strong"/>
-          <w:color w:val="auto"/>
-        </w:rPr>
-        <w:t>Media and Information Literacy</w:t>
-      </w:r>
-      <w:r>
-        <w:rPr>
-          <w:color w:val="auto"/>
-        </w:rPr>
-        <w:t xml:space="preserve"> — ASEAN Foundation (October 2026)</w:t>
-      </w:r>
-    </w:p>
-    <w:p>
-      <w:pPr>
-        <w:pStyle w:val="ListBullet"/>
-        <w:rPr>
-          <w:rFonts w:ascii="Times New Roman" w:eastAsia="Times New Roman" w:hAnsi="Times New Roman" w:cs="Times New Roman"/>
-          <w:color w:val="auto"/>
-        </w:rPr>
-      </w:pPr>
-      <w:r>
-        <w:rPr>
-          <w:rStyle w:val="Strong"/>
-          <w:color w:val="auto"/>
-        </w:rPr>
-        <w:t xml:space="preserve">AI Ready ASEAN - AI Learning Modules (12 </w:t>
-      </w:r>
-      <w:proofErr w:type="gramStart"/>
-      <w:r>
-        <w:rPr>
-          <w:rStyle w:val="Strong"/>
-          <w:color w:val="auto"/>
-        </w:rPr>
-        <w:t>hours)</w:t>
-      </w:r>
-      <w:r>
-        <w:rPr>
-          <w:color w:val="auto"/>
-        </w:rPr>
-        <w:t xml:space="preserve"> —</w:t>
-      </w:r>
-      <w:proofErr w:type="gramEnd"/>
-      <w:r>
-        <w:rPr>
-          <w:color w:val="auto"/>
-        </w:rPr>
-        <w:t xml:space="preserve"> ASEAN Foundation (October 2026)</w:t>
-      </w:r>
-    </w:p>
-    <w:p>
-      <w:pPr>
-        <w:pStyle w:val="ListBullet"/>
-        <w:rPr>
-          <w:color w:val="auto"/>
-        </w:rPr>
-      </w:pPr>
-      <w:r>
-        <w:rPr>
-          <w:rStyle w:val="Strong"/>
-          <w:color w:val="auto"/>
-        </w:rPr>
-        <w:t>Networking Basics</w:t>
-      </w:r>
-      <w:r>
-        <w:rPr>
-          <w:color w:val="auto"/>
-        </w:rPr>
-        <w:t xml:space="preserve"> — Cisco Networking Academy (September 2026)</w:t>
-      </w:r>
-    </w:p>
-    <w:p>
-      <w:pPr>
-        <w:pStyle w:val="ListBullet"/>
-        <w:rPr>
-          <w:color w:val="auto"/>
-        </w:rPr>
-      </w:pPr>
-      <w:r>
-        <w:rPr>
-          <w:rStyle w:val="Strong"/>
-          <w:color w:val="auto"/>
-        </w:rPr>
-        <w:t>Operating Systems Basics</w:t>
-      </w:r>
-      <w:r>
-        <w:rPr>
-          <w:color w:val="auto"/>
-        </w:rPr>
-        <w:t xml:space="preserve"> — Cisco Networking Academy (September 2026)</w:t>
-      </w:r>
-    </w:p>
-    <w:p>
-      <w:pPr>
-        <w:pStyle w:val="ListBullet"/>
-        <w:rPr>
-          <w:color w:val="auto"/>
-        </w:rPr>
-      </w:pPr>
-      <w:r>
-        <w:rPr>
-          <w:rStyle w:val="Strong"/>
-          <w:color w:val="auto"/>
-        </w:rPr>
-        <w:t>Computer Hardware Basics</w:t>
-      </w:r>
-      <w:r>
-        <w:rPr>
-          <w:color w:val="auto"/>
-        </w:rPr>
-        <w:t xml:space="preserve"> — Cisco Networking Academy (September 2026)</w:t>
-      </w:r>
-    </w:p>
-    <w:p>
-      <w:pPr>
-        <w:pStyle w:val="ListBullet"/>
-        <w:rPr>
-          <w:color w:val="auto"/>
-        </w:rPr>
-      </w:pPr>
-      <w:r>
-        <w:rPr>
-          <w:rStyle w:val="Strong"/>
-          <w:color w:val="auto"/>
-        </w:rPr>
-        <w:t>Startup Basics 101</w:t>
-      </w:r>
-      <w:r>
-        <w:rPr>
-          <w:color w:val="auto"/>
-        </w:rPr>
-        <w:t xml:space="preserve"> — </w:t>
-      </w:r>
-      <w:proofErr w:type="spellStart"/>
-      <w:r>
-        <w:rPr>
-          <w:color w:val="auto"/>
-        </w:rPr>
-        <w:t>iDEYA</w:t>
-      </w:r>
-      <w:proofErr w:type="spellEnd"/>
-      <w:r>
-        <w:rPr>
-          <w:color w:val="auto"/>
-        </w:rPr>
-        <w:t xml:space="preserve">: Center of Innovation and </w:t>
-      </w:r>
-      <w:proofErr w:type="spellStart"/>
-      <w:r>
-        <w:rPr>
-          <w:color w:val="auto"/>
-        </w:rPr>
-        <w:t>Technopreneurship</w:t>
-      </w:r>
-      <w:proofErr w:type="spellEnd"/>
-      <w:r>
-        <w:rPr>
-          <w:color w:val="auto"/>
-        </w:rPr>
-        <w:t>, MSU-IIT (September 2026)</w:t>
-      </w:r>
-    </w:p>
-    <w:p>
-      <w:pPr>
-        <w:pStyle w:val="Heading1"/>
-        <w:rPr>
-          <w:color w:val="auto"/>
-        </w:rPr>
-      </w:pPr>
-      <w:r>
-        <w:rPr>
-          <w:color w:val="auto"/>
-        </w:rPr>
-        <w:t>Skills and Interest</w:t>
+        <w:spacing w:before="0"/>
+        <w:jc w:val="both"/>
+        <w:rPr>
+          <w:color w:val="auto"/>
+        </w:rPr>
+      </w:pPr>
+      <w:r>
+        <w:rPr>
+          <w:color w:val="auto"/>
+        </w:rPr>
+        <w:t>Honors and Awards</w:t>
       </w:r>
     </w:p>
     <w:p>
@@ -2041,6 +1223,7 @@
           <w:ilvl w:val="0"/>
           <w:numId w:val="1"/>
         </w:numPr>
+        <w:jc w:val="both"/>
         <w:rPr>
           <w:color w:val="auto"/>
         </w:rPr>
@@ -2050,13 +1233,48 @@
           <w:b/>
           <w:color w:val="auto"/>
         </w:rPr>
-        <w:t>Programming and data</w:t>
-      </w:r>
-      <w:r>
-        <w:rPr>
-          <w:color w:val="auto"/>
-        </w:rPr>
-        <w:t xml:space="preserve"> — C/C++, Python, SQL and SQLite; AVR assembly coursework</w:t>
+        <w:t>Champion</w:t>
+      </w:r>
+      <w:r>
+        <w:rPr>
+          <w:b/>
+          <w:color w:val="auto"/>
+        </w:rPr>
+        <w:t xml:space="preserve">, </w:t>
+      </w:r>
+      <w:r>
+        <w:rPr>
+          <w:b/>
+          <w:color w:val="auto"/>
+        </w:rPr>
+        <w:t>Best in Pitching</w:t>
+      </w:r>
+      <w:r>
+        <w:rPr>
+          <w:b/>
+          <w:color w:val="auto"/>
+        </w:rPr>
+        <w:t xml:space="preserve"> </w:t>
+      </w:r>
+      <w:r>
+        <w:rPr>
+          <w:color w:val="auto"/>
+        </w:rPr>
+        <w:t xml:space="preserve">— </w:t>
+      </w:r>
+      <w:proofErr w:type="spellStart"/>
+      <w:r>
+        <w:rPr>
+          <w:color w:val="auto"/>
+        </w:rPr>
+        <w:t>TechShowcase</w:t>
+      </w:r>
+      <w:proofErr w:type="spellEnd"/>
+      <w:r>
+        <w:rPr>
+          <w:color w:val="auto"/>
+        </w:rPr>
+        <w:t xml:space="preserve"> 2025: Innovations in Application Development and Emerging Technologies (December 2025)</w:t>
       </w:r>
     </w:p>
     <w:p>
@@ -2067,6 +1285,7 @@
           <w:ilvl w:val="0"/>
           <w:numId w:val="1"/>
         </w:numPr>
+        <w:jc w:val="both"/>
         <w:rPr>
           <w:color w:val="auto"/>
         </w:rPr>
@@ -2076,13 +1295,41 @@
           <w:b/>
           <w:color w:val="auto"/>
         </w:rPr>
-        <w:t>Embedded systems</w:t>
-      </w:r>
-      <w:r>
-        <w:rPr>
-          <w:color w:val="auto"/>
-        </w:rPr>
-        <w:t xml:space="preserve"> — STM32, RT-Thread, FreeRTOS, Arduino, sensor integration, task scheduling, queues, ADC, I2C, UART, MQTT/TLS</w:t>
+        <w:t>1st Runner-Up</w:t>
+      </w:r>
+      <w:r>
+        <w:rPr>
+          <w:b/>
+          <w:color w:val="auto"/>
+        </w:rPr>
+        <w:t xml:space="preserve">, </w:t>
+      </w:r>
+      <w:r>
+        <w:rPr>
+          <w:b/>
+          <w:color w:val="auto"/>
+        </w:rPr>
+        <w:t>Best in Innovative System</w:t>
+      </w:r>
+      <w:r>
+        <w:rPr>
+          <w:color w:val="auto"/>
+        </w:rPr>
+        <w:t xml:space="preserve"> — </w:t>
+      </w:r>
+      <w:proofErr w:type="spellStart"/>
+      <w:r>
+        <w:rPr>
+          <w:color w:val="auto"/>
+        </w:rPr>
+        <w:t>TechShowcase</w:t>
+      </w:r>
+      <w:proofErr w:type="spellEnd"/>
+      <w:r>
+        <w:rPr>
+          <w:color w:val="auto"/>
+        </w:rPr>
+        <w:t xml:space="preserve"> 2025: Innovations in Application Development and Emerging Technologies (December 2025)</w:t>
       </w:r>
     </w:p>
     <w:p>
@@ -2093,6 +1340,7 @@
           <w:ilvl w:val="0"/>
           <w:numId w:val="1"/>
         </w:numPr>
+        <w:jc w:val="both"/>
         <w:rPr>
           <w:color w:val="auto"/>
         </w:rPr>
@@ -2102,13 +1350,161 @@
           <w:b/>
           <w:color w:val="auto"/>
         </w:rPr>
-        <w:t>AI and applications</w:t>
-      </w:r>
-      <w:r>
-        <w:rPr>
-          <w:color w:val="auto"/>
-        </w:rPr>
-        <w:t xml:space="preserve"> — YOLOv8n, Raspberry Pi 5, and Flask; Qt Widgets desktop applications</w:t>
+        <w:t>Certificate of Commendation</w:t>
+      </w:r>
+      <w:r>
+        <w:rPr>
+          <w:color w:val="auto"/>
+        </w:rPr>
+        <w:t xml:space="preserve"> — </w:t>
+      </w:r>
+      <w:r>
+        <w:rPr>
+          <w:color w:val="auto"/>
+        </w:rPr>
+        <w:t>Computer Applications</w:t>
+      </w:r>
+      <w:r>
+        <w:rPr>
+          <w:color w:val="auto"/>
+        </w:rPr>
+        <w:t xml:space="preserve">, </w:t>
+      </w:r>
+      <w:r>
+        <w:rPr>
+          <w:color w:val="auto"/>
+        </w:rPr>
+        <w:t xml:space="preserve">CCC102 Computer Programming 2, </w:t>
+      </w:r>
+      <w:r>
+        <w:rPr>
+          <w:color w:val="auto"/>
+        </w:rPr>
+        <w:t>MSU</w:t>
+      </w:r>
+      <w:r>
+        <w:rPr>
+          <w:color w:val="auto"/>
+        </w:rPr>
+        <w:t>-</w:t>
+      </w:r>
+      <w:r>
+        <w:rPr>
+          <w:color w:val="auto"/>
+        </w:rPr>
+        <w:t>IIT (March 2025)</w:t>
+      </w:r>
+    </w:p>
+    <w:p>
+      <w:pPr>
+        <w:pStyle w:val="ListBullet"/>
+        <w:jc w:val="both"/>
+        <w:rPr>
+          <w:rFonts w:ascii="Times New Roman" w:eastAsia="Times New Roman" w:hAnsi="Times New Roman" w:cs="Times New Roman"/>
+          <w:color w:val="auto"/>
+        </w:rPr>
+      </w:pPr>
+      <w:r>
+        <w:rPr>
+          <w:rStyle w:val="Strong"/>
+        </w:rPr>
+        <w:t>Champion</w:t>
+      </w:r>
+      <w:r>
+        <w:t xml:space="preserve"> — Sustainable Innovation Pitch, 2024 Sustainable Development Day Celebration, MSU-IIT (September 25, 2024)</w:t>
+      </w:r>
+    </w:p>
+    <w:p>
+      <w:pPr>
+        <w:pStyle w:val="ListBullet"/>
+        <w:jc w:val="both"/>
+        <w:rPr>
+          <w:rFonts w:ascii="Times New Roman" w:eastAsia="Times New Roman" w:hAnsi="Times New Roman" w:cs="Times New Roman"/>
+          <w:color w:val="auto"/>
+        </w:rPr>
+      </w:pPr>
+      <w:r>
+        <w:rPr>
+          <w:rStyle w:val="Strong"/>
+        </w:rPr>
+        <w:t>Learner Sharer</w:t>
+      </w:r>
+      <w:r>
+        <w:t xml:space="preserve"> </w:t>
+      </w:r>
+      <w:r>
+        <w:rPr>
+          <w:b/>
+          <w:bCs/>
+        </w:rPr>
+        <w:t>Speaker</w:t>
+      </w:r>
+      <w:r>
+        <w:t xml:space="preserve"> — Grade 10 Senior High School Orientation, Tomas Cabili National High School (April 2023)</w:t>
+      </w:r>
+    </w:p>
+    <w:p>
+      <w:pPr>
+        <w:pStyle w:val="ListBullet"/>
+        <w:jc w:val="both"/>
+      </w:pPr>
+      <w:r>
+        <w:rPr>
+          <w:rStyle w:val="Strong"/>
+        </w:rPr>
+        <w:t>Fourth Place</w:t>
+      </w:r>
+      <w:r>
+        <w:rPr>
+          <w:rStyle w:val="Strong"/>
+        </w:rPr>
+        <w:t xml:space="preserve">, </w:t>
+      </w:r>
+      <w:r>
+        <w:rPr>
+          <w:rStyle w:val="Strong"/>
+        </w:rPr>
+        <w:t>Winning Coach</w:t>
+      </w:r>
+      <w:r>
+        <w:t xml:space="preserve"> — </w:t>
+      </w:r>
+      <w:proofErr w:type="spellStart"/>
+      <w:r>
+        <w:t>Siyensikula</w:t>
+      </w:r>
+      <w:proofErr w:type="spellEnd"/>
+      <w:r>
+        <w:t xml:space="preserve">, Senior High School Category, Division Science and Technology Fair, Tomas </w:t>
+      </w:r>
+      <w:proofErr w:type="spellStart"/>
+      <w:r>
+        <w:t>Cabili</w:t>
+      </w:r>
+      <w:proofErr w:type="spellEnd"/>
+      <w:r>
+        <w:t xml:space="preserve"> National High School (December 14, 2022)</w:t>
+      </w:r>
+    </w:p>
+    <w:p>
+      <w:pPr>
+        <w:pStyle w:val="Heading1"/>
+        <w:jc w:val="both"/>
+        <w:rPr>
+          <w:color w:val="auto"/>
+        </w:rPr>
+      </w:pPr>
+      <w:r>
+        <w:rPr>
+          <w:color w:val="auto"/>
+        </w:rPr>
+        <w:t>Leadership and Activities</w:t>
+      </w:r>
+      <w:r>
+        <w:rPr>
+          <w:color w:val="auto"/>
+        </w:rPr>
+        <w:t xml:space="preserve"> </w:t>
       </w:r>
     </w:p>
     <w:p>
@@ -2119,6 +1515,7 @@
           <w:ilvl w:val="0"/>
           <w:numId w:val="1"/>
         </w:numPr>
+        <w:jc w:val="both"/>
         <w:rPr>
           <w:color w:val="auto"/>
         </w:rPr>
@@ -2128,13 +1525,25 @@
           <w:b/>
           <w:color w:val="auto"/>
         </w:rPr>
-        <w:t>Development tools</w:t>
-      </w:r>
-      <w:r>
-        <w:rPr>
-          <w:color w:val="auto"/>
-        </w:rPr>
-        <w:t xml:space="preserve"> — Git, GitHub, Visual Studio Code, PlatformIO, RT-Thread Studio, Wokwi, Microchip Studio</w:t>
+        <w:t>Legislative Secretary, Administrative Committee</w:t>
+      </w:r>
+      <w:r>
+        <w:rPr>
+          <w:color w:val="auto"/>
+        </w:rPr>
+        <w:t xml:space="preserve"> — College of Computer Studies Student Council, MSU-IIT </w:t>
+      </w:r>
+      <w:r>
+        <w:rPr>
+          <w:color w:val="auto"/>
+        </w:rPr>
+        <w:t>(2026 – Present)</w:t>
+      </w:r>
+      <w:r>
+        <w:rPr>
+          <w:color w:val="auto"/>
+        </w:rPr>
+        <w:t xml:space="preserve"> </w:t>
       </w:r>
     </w:p>
     <w:p>
@@ -2145,6 +1554,7 @@
           <w:ilvl w:val="0"/>
           <w:numId w:val="1"/>
         </w:numPr>
+        <w:jc w:val="both"/>
         <w:rPr>
           <w:color w:val="auto"/>
         </w:rPr>
@@ -2154,13 +1564,26 @@
           <w:b/>
           <w:color w:val="auto"/>
         </w:rPr>
-        <w:t>Prototyping</w:t>
-      </w:r>
-      <w:r>
-        <w:rPr>
-          <w:color w:val="auto"/>
-        </w:rPr>
-        <w:t xml:space="preserve"> — Breadboard circuits, PCB soldering, Autodesk Fusion 360, laser cutting, CNC router operation</w:t>
+        <w:t>Co-Chairperson, Ways and Means Committee</w:t>
+      </w:r>
+      <w:r>
+        <w:rPr>
+          <w:b/>
+          <w:color w:val="auto"/>
+        </w:rPr>
+        <w:t xml:space="preserve"> </w:t>
+      </w:r>
+      <w:r>
+        <w:rPr>
+          <w:color w:val="auto"/>
+        </w:rPr>
+        <w:t>— College of Computer Studies Student Council, MSU-IIT</w:t>
+      </w:r>
+      <w:r>
+        <w:rPr>
+          <w:color w:val="auto"/>
+        </w:rPr>
+        <w:t xml:space="preserve"> (2025 – 2026)</w:t>
       </w:r>
     </w:p>
     <w:p>
@@ -2171,6 +1594,668 @@
           <w:ilvl w:val="0"/>
           <w:numId w:val="1"/>
         </w:numPr>
+        <w:jc w:val="both"/>
+        <w:rPr>
+          <w:color w:val="auto"/>
+        </w:rPr>
+      </w:pPr>
+      <w:r>
+        <w:rPr>
+          <w:b/>
+          <w:color w:val="auto"/>
+        </w:rPr>
+        <w:t>Secretary, Special Events Committee</w:t>
+      </w:r>
+      <w:r>
+        <w:rPr>
+          <w:b/>
+          <w:color w:val="auto"/>
+        </w:rPr>
+        <w:t xml:space="preserve"> </w:t>
+      </w:r>
+      <w:r>
+        <w:rPr>
+          <w:color w:val="auto"/>
+        </w:rPr>
+        <w:t>— College of Computer Studies Student Council, MSU-IIT</w:t>
+      </w:r>
+      <w:r>
+        <w:rPr>
+          <w:color w:val="auto"/>
+        </w:rPr>
+        <w:t xml:space="preserve"> (2024 – 2025)</w:t>
+      </w:r>
+    </w:p>
+    <w:p>
+      <w:pPr>
+        <w:pStyle w:val="CVEntry"/>
+        <w:keepLines/>
+        <w:numPr>
+          <w:ilvl w:val="0"/>
+          <w:numId w:val="1"/>
+        </w:numPr>
+        <w:jc w:val="both"/>
+        <w:rPr>
+          <w:color w:val="auto"/>
+        </w:rPr>
+      </w:pPr>
+      <w:r>
+        <w:rPr>
+          <w:b/>
+          <w:color w:val="auto"/>
+        </w:rPr>
+        <w:t xml:space="preserve">Undersecretary, Computer Applications Society </w:t>
+      </w:r>
+      <w:r>
+        <w:rPr>
+          <w:color w:val="auto"/>
+        </w:rPr>
+        <w:t>— College of Computer Studies, MSU-IIT (2023– 2024)</w:t>
+      </w:r>
+    </w:p>
+    <w:p>
+      <w:pPr>
+        <w:pStyle w:val="CVEntry"/>
+        <w:keepLines/>
+        <w:numPr>
+          <w:ilvl w:val="0"/>
+          <w:numId w:val="1"/>
+        </w:numPr>
+        <w:jc w:val="both"/>
+        <w:rPr>
+          <w:color w:val="auto"/>
+        </w:rPr>
+      </w:pPr>
+      <w:r>
+        <w:rPr>
+          <w:b/>
+          <w:color w:val="auto"/>
+        </w:rPr>
+        <w:t>Lead, Program and Technical Committee</w:t>
+      </w:r>
+      <w:r>
+        <w:rPr>
+          <w:color w:val="auto"/>
+        </w:rPr>
+        <w:t xml:space="preserve"> — my.ComApps Technology Symposium and Exhibit, MSU-IIT (November 2025)</w:t>
+      </w:r>
+    </w:p>
+    <w:p>
+      <w:pPr>
+        <w:pStyle w:val="CVEntry"/>
+        <w:keepLines/>
+        <w:numPr>
+          <w:ilvl w:val="0"/>
+          <w:numId w:val="1"/>
+        </w:numPr>
+        <w:jc w:val="both"/>
+        <w:rPr>
+          <w:color w:val="auto"/>
+        </w:rPr>
+      </w:pPr>
+      <w:r>
+        <w:rPr>
+          <w:b/>
+          <w:color w:val="auto"/>
+        </w:rPr>
+        <w:t>Co-Lead, Sponsorship Team</w:t>
+      </w:r>
+      <w:r>
+        <w:rPr>
+          <w:color w:val="auto"/>
+        </w:rPr>
+        <w:t xml:space="preserve"> — Iligan Campus DEVCON 2025 (October 2025)</w:t>
+      </w:r>
+    </w:p>
+    <w:p>
+      <w:pPr>
+        <w:pStyle w:val="CVEntry"/>
+        <w:keepLines/>
+        <w:numPr>
+          <w:ilvl w:val="0"/>
+          <w:numId w:val="1"/>
+        </w:numPr>
+        <w:jc w:val="both"/>
+        <w:rPr>
+          <w:color w:val="auto"/>
+        </w:rPr>
+      </w:pPr>
+      <w:r>
+        <w:rPr>
+          <w:b/>
+          <w:color w:val="auto"/>
+        </w:rPr>
+        <w:t>Event Organizer</w:t>
+      </w:r>
+      <w:r>
+        <w:rPr>
+          <w:color w:val="auto"/>
+        </w:rPr>
+        <w:t xml:space="preserve"> — IEEE Smart Mobility Hackathon, MSU-IIT (September 2025)</w:t>
+      </w:r>
+    </w:p>
+    <w:p>
+      <w:pPr>
+        <w:pStyle w:val="CVEntry"/>
+        <w:keepLines/>
+        <w:numPr>
+          <w:ilvl w:val="0"/>
+          <w:numId w:val="1"/>
+        </w:numPr>
+        <w:jc w:val="both"/>
+        <w:rPr>
+          <w:color w:val="auto"/>
+        </w:rPr>
+      </w:pPr>
+      <w:r>
+        <w:rPr>
+          <w:b/>
+          <w:color w:val="auto"/>
+        </w:rPr>
+        <w:t>Lead, Registration Committee</w:t>
+      </w:r>
+      <w:r>
+        <w:rPr>
+          <w:color w:val="auto"/>
+        </w:rPr>
+        <w:t xml:space="preserve"> — </w:t>
+      </w:r>
+      <w:proofErr w:type="spellStart"/>
+      <w:r>
+        <w:rPr>
+          <w:color w:val="auto"/>
+        </w:rPr>
+        <w:t>my.ComApps</w:t>
+      </w:r>
+      <w:proofErr w:type="spellEnd"/>
+      <w:r>
+        <w:rPr>
+          <w:color w:val="auto"/>
+        </w:rPr>
+        <w:t xml:space="preserve"> - </w:t>
+      </w:r>
+      <w:r>
+        <w:rPr>
+          <w:color w:val="auto"/>
+        </w:rPr>
+        <w:t>A Technology Development Program, MSU-IIT (December 2024)</w:t>
+      </w:r>
+    </w:p>
+    <w:p>
+      <w:pPr>
+        <w:pStyle w:val="Heading1"/>
+        <w:jc w:val="both"/>
+        <w:rPr>
+          <w:color w:val="auto"/>
+        </w:rPr>
+      </w:pPr>
+      <w:r>
+        <w:rPr>
+          <w:color w:val="auto"/>
+        </w:rPr>
+        <w:t>Certifications and Training</w:t>
+      </w:r>
+    </w:p>
+    <w:p>
+      <w:pPr>
+        <w:pStyle w:val="ListBullet"/>
+        <w:jc w:val="both"/>
+        <w:rPr>
+          <w:color w:val="auto"/>
+        </w:rPr>
+      </w:pPr>
+      <w:r>
+        <w:rPr>
+          <w:rStyle w:val="Strong"/>
+          <w:color w:val="auto"/>
+        </w:rPr>
+        <w:t>AI Career Readiness Training</w:t>
+      </w:r>
+      <w:r>
+        <w:rPr>
+          <w:color w:val="auto"/>
+        </w:rPr>
+        <w:t xml:space="preserve"> — ASEAN Foundation (October 2026)</w:t>
+      </w:r>
+    </w:p>
+    <w:p>
+      <w:pPr>
+        <w:pStyle w:val="ListBullet"/>
+        <w:jc w:val="both"/>
+        <w:rPr>
+          <w:color w:val="auto"/>
+        </w:rPr>
+      </w:pPr>
+      <w:r>
+        <w:rPr>
+          <w:rStyle w:val="Strong"/>
+          <w:color w:val="auto"/>
+        </w:rPr>
+        <w:t>Media and Information Literacy</w:t>
+      </w:r>
+      <w:r>
+        <w:rPr>
+          <w:color w:val="auto"/>
+        </w:rPr>
+        <w:t xml:space="preserve"> — ASEAN Foundation (October 2026)</w:t>
+      </w:r>
+    </w:p>
+    <w:p>
+      <w:pPr>
+        <w:pStyle w:val="ListBullet"/>
+        <w:jc w:val="both"/>
+        <w:rPr>
+          <w:rFonts w:ascii="Times New Roman" w:eastAsia="Times New Roman" w:hAnsi="Times New Roman" w:cs="Times New Roman"/>
+          <w:color w:val="auto"/>
+        </w:rPr>
+      </w:pPr>
+      <w:r>
+        <w:rPr>
+          <w:rStyle w:val="Strong"/>
+          <w:color w:val="auto"/>
+        </w:rPr>
+        <w:t>AI Ready ASEAN - AI Learning Modules (12 hours)</w:t>
+      </w:r>
+      <w:r>
+        <w:rPr>
+          <w:color w:val="auto"/>
+        </w:rPr>
+        <w:t xml:space="preserve"> — ASEAN Foundation (October 2026)</w:t>
+      </w:r>
+    </w:p>
+    <w:p>
+      <w:pPr>
+        <w:pStyle w:val="ListBullet"/>
+        <w:jc w:val="both"/>
+        <w:rPr>
+          <w:color w:val="auto"/>
+        </w:rPr>
+      </w:pPr>
+      <w:r>
+        <w:rPr>
+          <w:rStyle w:val="Strong"/>
+          <w:color w:val="auto"/>
+        </w:rPr>
+        <w:t>Networking Basics</w:t>
+      </w:r>
+      <w:r>
+        <w:rPr>
+          <w:color w:val="auto"/>
+        </w:rPr>
+        <w:t xml:space="preserve"> — Cisco Networking Academy (September 2026)</w:t>
+      </w:r>
+    </w:p>
+    <w:p>
+      <w:pPr>
+        <w:pStyle w:val="ListBullet"/>
+        <w:jc w:val="both"/>
+        <w:rPr>
+          <w:color w:val="auto"/>
+        </w:rPr>
+      </w:pPr>
+      <w:r>
+        <w:rPr>
+          <w:rStyle w:val="Strong"/>
+          <w:color w:val="auto"/>
+        </w:rPr>
+        <w:t>Operating Systems Basics</w:t>
+      </w:r>
+      <w:r>
+        <w:rPr>
+          <w:color w:val="auto"/>
+        </w:rPr>
+        <w:t xml:space="preserve"> — Cisco Networking Academy (September 2026)</w:t>
+      </w:r>
+    </w:p>
+    <w:p>
+      <w:pPr>
+        <w:pStyle w:val="ListBullet"/>
+        <w:jc w:val="both"/>
+        <w:rPr>
+          <w:color w:val="auto"/>
+        </w:rPr>
+      </w:pPr>
+      <w:r>
+        <w:rPr>
+          <w:rStyle w:val="Strong"/>
+          <w:color w:val="auto"/>
+        </w:rPr>
+        <w:t>Computer Hardware Basics</w:t>
+      </w:r>
+      <w:r>
+        <w:rPr>
+          <w:color w:val="auto"/>
+        </w:rPr>
+        <w:t xml:space="preserve"> — Cisco Networking Academy (September 2026)</w:t>
+      </w:r>
+    </w:p>
+    <w:p>
+      <w:pPr>
+        <w:pStyle w:val="ListBullet"/>
+        <w:jc w:val="both"/>
+        <w:rPr>
+          <w:color w:val="auto"/>
+        </w:rPr>
+      </w:pPr>
+      <w:r>
+        <w:rPr>
+          <w:rStyle w:val="Strong"/>
+          <w:color w:val="auto"/>
+        </w:rPr>
+        <w:t>Startup Basics 101</w:t>
+      </w:r>
+      <w:r>
+        <w:rPr>
+          <w:color w:val="auto"/>
+        </w:rPr>
+        <w:t xml:space="preserve"> — </w:t>
+      </w:r>
+      <w:proofErr w:type="spellStart"/>
+      <w:r>
+        <w:rPr>
+          <w:color w:val="auto"/>
+        </w:rPr>
+        <w:t>iDEYA</w:t>
+      </w:r>
+      <w:proofErr w:type="spellEnd"/>
+      <w:r>
+        <w:rPr>
+          <w:color w:val="auto"/>
+        </w:rPr>
+        <w:t xml:space="preserve">: Center of Innovation and </w:t>
+      </w:r>
+      <w:proofErr w:type="spellStart"/>
+      <w:r>
+        <w:rPr>
+          <w:color w:val="auto"/>
+        </w:rPr>
+        <w:t>Technopreneurship</w:t>
+      </w:r>
+      <w:proofErr w:type="spellEnd"/>
+      <w:r>
+        <w:rPr>
+          <w:color w:val="auto"/>
+        </w:rPr>
+        <w:t>, MSU-IIT (September 2026)</w:t>
+      </w:r>
+    </w:p>
+    <w:p>
+      <w:pPr>
+        <w:pStyle w:val="Heading1"/>
+        <w:jc w:val="both"/>
+        <w:rPr>
+          <w:color w:val="auto"/>
+        </w:rPr>
+      </w:pPr>
+      <w:r>
+        <w:rPr>
+          <w:color w:val="auto"/>
+        </w:rPr>
+        <w:t>Skills and Interest</w:t>
+      </w:r>
+    </w:p>
+    <w:p>
+      <w:pPr>
+        <w:pStyle w:val="CVEntry"/>
+        <w:keepLines/>
+        <w:numPr>
+          <w:ilvl w:val="0"/>
+          <w:numId w:val="1"/>
+        </w:numPr>
+        <w:jc w:val="both"/>
+        <w:rPr>
+          <w:color w:val="auto"/>
+        </w:rPr>
+      </w:pPr>
+      <w:r>
+        <w:rPr>
+          <w:b/>
+          <w:color w:val="auto"/>
+        </w:rPr>
+        <w:t>Programming and data</w:t>
+      </w:r>
+      <w:r>
+        <w:rPr>
+          <w:color w:val="auto"/>
+        </w:rPr>
+        <w:t xml:space="preserve"> — C/C++, Python, SQL and SQLite; AVR assembly coursework</w:t>
+      </w:r>
+    </w:p>
+    <w:p>
+      <w:pPr>
+        <w:pStyle w:val="CVEntry"/>
+        <w:keepLines/>
+        <w:numPr>
+          <w:ilvl w:val="0"/>
+          <w:numId w:val="1"/>
+        </w:numPr>
+        <w:jc w:val="both"/>
+        <w:rPr>
+          <w:lang w:val="en-PH"/>
+        </w:rPr>
+      </w:pPr>
+      <w:r>
+        <w:rPr>
+          <w:b/>
+          <w:color w:val="auto"/>
+        </w:rPr>
+        <w:t>Embedded systems</w:t>
+      </w:r>
+      <w:r>
+        <w:rPr>
+          <w:color w:val="auto"/>
+        </w:rPr>
+        <w:t xml:space="preserve"> </w:t>
+      </w:r>
+      <w:r>
+        <w:rPr>
+          <w:color w:val="auto"/>
+        </w:rPr>
+        <w:t>and IoT</w:t>
+      </w:r>
+      <w:r>
+        <w:rPr>
+          <w:color w:val="auto"/>
+        </w:rPr>
+        <w:t xml:space="preserve">— </w:t>
+      </w:r>
+      <w:r>
+        <w:rPr>
+          <w:lang w:val="en-PH"/>
+        </w:rPr>
+        <w:t xml:space="preserve">STM32, ESP32, Raspberry Pi 5, Arduino Uno, RT-Thread, </w:t>
+      </w:r>
+      <w:proofErr w:type="spellStart"/>
+      <w:r>
+        <w:rPr>
+          <w:lang w:val="en-PH"/>
+        </w:rPr>
+        <w:t>FreeRTOS</w:t>
+      </w:r>
+      <w:proofErr w:type="spellEnd"/>
+      <w:r>
+        <w:rPr>
+          <w:lang w:val="en-PH"/>
+        </w:rPr>
+        <w:t>; sensor integration, task scheduling, queues, ADC, I2C, UART, MQTT/TLS</w:t>
+      </w:r>
+    </w:p>
+    <w:p>
+      <w:pPr>
+        <w:pStyle w:val="CVEntry"/>
+        <w:keepLines/>
+        <w:numPr>
+          <w:ilvl w:val="0"/>
+          <w:numId w:val="1"/>
+        </w:numPr>
+        <w:jc w:val="both"/>
+        <w:rPr>
+          <w:lang w:val="en-PH"/>
+        </w:rPr>
+      </w:pPr>
+      <w:r>
+        <w:rPr>
+          <w:b/>
+          <w:color w:val="auto"/>
+        </w:rPr>
+        <w:t>AI and applications</w:t>
+      </w:r>
+      <w:r>
+        <w:rPr>
+          <w:color w:val="auto"/>
+        </w:rPr>
+        <w:t xml:space="preserve"> — </w:t>
+      </w:r>
+      <w:r>
+        <w:rPr>
+          <w:lang w:val="en-PH"/>
+        </w:rPr>
+        <w:t>YOLOv8n</w:t>
+      </w:r>
+      <w:r>
+        <w:rPr>
+          <w:lang w:val="en-PH"/>
+        </w:rPr>
+        <w:t xml:space="preserve">, </w:t>
+      </w:r>
+      <w:r>
+        <w:rPr>
+          <w:lang w:val="en-PH"/>
+        </w:rPr>
+        <w:t>Edge Impulse, Flask, Qt Widgets, Android Studio</w:t>
+      </w:r>
+    </w:p>
+    <w:p>
+      <w:pPr>
+        <w:pStyle w:val="CVEntry"/>
+        <w:keepLines/>
+        <w:numPr>
+          <w:ilvl w:val="0"/>
+          <w:numId w:val="1"/>
+        </w:numPr>
+        <w:jc w:val="both"/>
+        <w:rPr>
+          <w:lang w:val="en-PH"/>
+        </w:rPr>
+      </w:pPr>
+      <w:r>
+        <w:rPr>
+          <w:b/>
+          <w:color w:val="auto"/>
+        </w:rPr>
+        <w:t>Development tools</w:t>
+      </w:r>
+      <w:r>
+        <w:rPr>
+          <w:color w:val="auto"/>
+        </w:rPr>
+        <w:t xml:space="preserve"> — </w:t>
+      </w:r>
+      <w:r>
+        <w:rPr>
+          <w:lang w:val="en-PH"/>
+        </w:rPr>
+        <w:t xml:space="preserve">Git, GitHub, Visual Studio Code, </w:t>
+      </w:r>
+      <w:proofErr w:type="spellStart"/>
+      <w:r>
+        <w:rPr>
+          <w:lang w:val="en-PH"/>
+        </w:rPr>
+        <w:t>PlatformIO</w:t>
+      </w:r>
+      <w:proofErr w:type="spellEnd"/>
+      <w:r>
+        <w:rPr>
+          <w:lang w:val="en-PH"/>
+        </w:rPr>
+        <w:t xml:space="preserve">, STM32CubeIDE, RT-Thread Studio, Arduino IDE, Microchip Studio, </w:t>
+      </w:r>
+      <w:proofErr w:type="spellStart"/>
+      <w:r>
+        <w:rPr>
+          <w:lang w:val="en-PH"/>
+        </w:rPr>
+        <w:t>SimulIDE</w:t>
+      </w:r>
+      <w:proofErr w:type="spellEnd"/>
+      <w:r>
+        <w:rPr>
+          <w:lang w:val="en-PH"/>
+        </w:rPr>
+        <w:t xml:space="preserve">, </w:t>
+      </w:r>
+      <w:proofErr w:type="spellStart"/>
+      <w:r>
+        <w:rPr>
+          <w:lang w:val="en-PH"/>
+        </w:rPr>
+        <w:t>Wokwi</w:t>
+      </w:r>
+      <w:proofErr w:type="spellEnd"/>
+      <w:r>
+        <w:rPr>
+          <w:lang w:val="en-PH"/>
+        </w:rPr>
+        <w:t>,</w:t>
+      </w:r>
+    </w:p>
+    <w:p>
+      <w:pPr>
+        <w:pStyle w:val="CVEntry"/>
+        <w:keepLines/>
+        <w:numPr>
+          <w:ilvl w:val="0"/>
+          <w:numId w:val="1"/>
+        </w:numPr>
+        <w:jc w:val="both"/>
+        <w:rPr>
+          <w:lang w:val="en-PH"/>
+        </w:rPr>
+      </w:pPr>
+      <w:r>
+        <w:rPr>
+          <w:b/>
+          <w:color w:val="auto"/>
+        </w:rPr>
+        <w:t>Prototyping</w:t>
+      </w:r>
+      <w:r>
+        <w:rPr>
+          <w:color w:val="auto"/>
+        </w:rPr>
+        <w:t xml:space="preserve"> — </w:t>
+      </w:r>
+      <w:r>
+        <w:rPr>
+          <w:lang w:val="en-PH"/>
+        </w:rPr>
+        <w:t xml:space="preserve">Autodesk Fusion 360, Adobe Photoshop, </w:t>
+      </w:r>
+      <w:proofErr w:type="spellStart"/>
+      <w:r>
+        <w:rPr>
+          <w:lang w:val="en-PH"/>
+        </w:rPr>
+        <w:t>SquareLine</w:t>
+      </w:r>
+      <w:proofErr w:type="spellEnd"/>
+      <w:r>
+        <w:rPr>
+          <w:lang w:val="en-PH"/>
+        </w:rPr>
+        <w:t xml:space="preserve"> Studio, breadboard circuits, PCB layout and soldering, laser cutting, CNC router operation</w:t>
+      </w:r>
+    </w:p>
+    <w:p>
+      <w:pPr>
+        <w:pStyle w:val="CVEntry"/>
+        <w:keepLines/>
+        <w:numPr>
+          <w:ilvl w:val="0"/>
+          <w:numId w:val="1"/>
+        </w:numPr>
+        <w:jc w:val="both"/>
         <w:rPr>
           <w:color w:val="auto"/>
           <w:lang w:val="en-PH"/>
@@ -2192,44 +2277,6 @@
         </w:rPr>
         <w:t xml:space="preserve">— English, Filipino, Cebuano </w:t>
       </w:r>
-    </w:p>
-    <w:p>
-      <w:pPr>
-        <w:pStyle w:val="CVEntry"/>
-        <w:keepLines/>
-        <w:ind w:left="0" w:firstLine="0"/>
-        <w:rPr>
-          <w:color w:val="auto"/>
-        </w:rPr>
-      </w:pPr>
-    </w:p>
-    <w:p>
-      <w:pPr>
-        <w:pStyle w:val="CVEntry"/>
-        <w:keepLines/>
-        <w:ind w:left="0" w:firstLine="0"/>
-        <w:rPr>
-          <w:color w:val="auto"/>
-          <w:lang w:val="en-PH"/>
-        </w:rPr>
-      </w:pPr>
-      <w:r>
-        <w:rPr>
-          <w:color w:val="auto"/>
-          <w:lang w:val="en-PH"/>
-        </w:rPr>
-        <w:t xml:space="preserve"> </w:t>
-      </w:r>
-    </w:p>
-    <w:p>
-      <w:pPr>
-        <w:pStyle w:val="CVEntry"/>
-        <w:keepLines/>
-        <w:ind w:left="0" w:firstLine="0"/>
-        <w:rPr>
-          <w:color w:val="auto"/>
-        </w:rPr>
-      </w:pPr>
     </w:p>
     <w:sectPr>
       <w:pgSz w:w="12240" w:h="15840"/>
@@ -2442,7 +2489,7 @@
   <w:abstractNum w:abstractNumId="9" w15:restartNumberingAfterBreak="0">
     <w:nsid w:val="FFFFFF89"/>
     <w:multiLevelType w:val="singleLevel"/>
-    <w:tmpl w:val="29761A62"/>
+    <w:tmpl w:val="7994A8BA"/>
     <w:lvl w:ilvl="0">
       <w:start w:val="1"/>
       <w:numFmt w:val="bullet"/>
@@ -2521,6 +2568,155 @@
     </w:lvl>
   </w:abstractNum>
   <w:abstractNum w:abstractNumId="11" w15:restartNumberingAfterBreak="0">
+    <w:nsid w:val="24CC6318"/>
+    <w:multiLevelType w:val="multilevel"/>
+    <w:tmpl w:val="CF801606"/>
+    <w:lvl w:ilvl="0">
+      <w:start w:val="1"/>
+      <w:numFmt w:val="bullet"/>
+      <w:lvlText w:val=""/>
+      <w:lvlJc w:val="left"/>
+      <w:pPr>
+        <w:tabs>
+          <w:tab w:val="num" w:pos="720"/>
+        </w:tabs>
+        <w:ind w:left="720" w:hanging="360"/>
+      </w:pPr>
+      <w:rPr>
+        <w:rFonts w:ascii="Symbol" w:hAnsi="Symbol" w:hint="default"/>
+        <w:sz w:val="20"/>
+      </w:rPr>
+    </w:lvl>
+    <w:lvl w:ilvl="1" w:tentative="1">
+      <w:start w:val="1"/>
+      <w:numFmt w:val="bullet"/>
+      <w:lvlText w:val="o"/>
+      <w:lvlJc w:val="left"/>
+      <w:pPr>
+        <w:tabs>
+          <w:tab w:val="num" w:pos="1440"/>
+        </w:tabs>
+        <w:ind w:left="1440" w:hanging="360"/>
+      </w:pPr>
+      <w:rPr>
+        <w:rFonts w:ascii="Courier New" w:hAnsi="Courier New" w:hint="default"/>
+        <w:sz w:val="20"/>
+      </w:rPr>
+    </w:lvl>
+    <w:lvl w:ilvl="2" w:tentative="1">
+      <w:start w:val="1"/>
+      <w:numFmt w:val="bullet"/>
+      <w:lvlText w:val=""/>
+      <w:lvlJc w:val="left"/>
+      <w:pPr>
+        <w:tabs>
+          <w:tab w:val="num" w:pos="2160"/>
+        </w:tabs>
+        <w:ind w:left="2160" w:hanging="360"/>
+      </w:pPr>
+      <w:rPr>
+        <w:rFonts w:ascii="Wingdings" w:hAnsi="Wingdings" w:hint="default"/>
+        <w:sz w:val="20"/>
+      </w:rPr>
+    </w:lvl>
+    <w:lvl w:ilvl="3" w:tentative="1">
+      <w:start w:val="1"/>
+      <w:numFmt w:val="bullet"/>
+      <w:lvlText w:val=""/>
+      <w:lvlJc w:val="left"/>
+      <w:pPr>
+        <w:tabs>
+          <w:tab w:val="num" w:pos="2880"/>
+        </w:tabs>
+        <w:ind w:left="2880" w:hanging="360"/>
+      </w:pPr>
+      <w:rPr>
+        <w:rFonts w:ascii="Wingdings" w:hAnsi="Wingdings" w:hint="default"/>
+        <w:sz w:val="20"/>
+      </w:rPr>
+    </w:lvl>
+    <w:lvl w:ilvl="4" w:tentative="1">
+      <w:start w:val="1"/>
+      <w:numFmt w:val="bullet"/>
+      <w:lvlText w:val=""/>
+      <w:lvlJc w:val="left"/>
+      <w:pPr>
+        <w:tabs>
+          <w:tab w:val="num" w:pos="3600"/>
+        </w:tabs>
+        <w:ind w:left="3600" w:hanging="360"/>
+      </w:pPr>
+      <w:rPr>
+        <w:rFonts w:ascii="Wingdings" w:hAnsi="Wingdings" w:hint="default"/>
+        <w:sz w:val="20"/>
+      </w:rPr>
+    </w:lvl>
+    <w:lvl w:ilvl="5" w:tentative="1">
+      <w:start w:val="1"/>
+      <w:numFmt w:val="bullet"/>
+      <w:lvlText w:val=""/>
+      <w:lvlJc w:val="left"/>
+      <w:pPr>
+        <w:tabs>
+          <w:tab w:val="num" w:pos="4320"/>
+        </w:tabs>
+        <w:ind w:left="4320" w:hanging="360"/>
+      </w:pPr>
+      <w:rPr>
+        <w:rFonts w:ascii="Wingdings" w:hAnsi="Wingdings" w:hint="default"/>
+        <w:sz w:val="20"/>
+      </w:rPr>
+    </w:lvl>
+    <w:lvl w:ilvl="6" w:tentative="1">
+      <w:start w:val="1"/>
+      <w:numFmt w:val="bullet"/>
+      <w:lvlText w:val=""/>
+      <w:lvlJc w:val="left"/>
+      <w:pPr>
+        <w:tabs>
+          <w:tab w:val="num" w:pos="5040"/>
+        </w:tabs>
+        <w:ind w:left="5040" w:hanging="360"/>
+      </w:pPr>
+      <w:rPr>
+        <w:rFonts w:ascii="Wingdings" w:hAnsi="Wingdings" w:hint="default"/>
+        <w:sz w:val="20"/>
+      </w:rPr>
+    </w:lvl>
+    <w:lvl w:ilvl="7" w:tentative="1">
+      <w:start w:val="1"/>
+      <w:numFmt w:val="bullet"/>
+      <w:lvlText w:val=""/>
+      <w:lvlJc w:val="left"/>
+      <w:pPr>
+        <w:tabs>
+          <w:tab w:val="num" w:pos="5760"/>
+        </w:tabs>
+        <w:ind w:left="5760" w:hanging="360"/>
+      </w:pPr>
+      <w:rPr>
+        <w:rFonts w:ascii="Wingdings" w:hAnsi="Wingdings" w:hint="default"/>
+        <w:sz w:val="20"/>
+      </w:rPr>
+    </w:lvl>
+    <w:lvl w:ilvl="8" w:tentative="1">
+      <w:start w:val="1"/>
+      <w:numFmt w:val="bullet"/>
+      <w:lvlText w:val=""/>
+      <w:lvlJc w:val="left"/>
+      <w:pPr>
+        <w:tabs>
+          <w:tab w:val="num" w:pos="6480"/>
+        </w:tabs>
+        <w:ind w:left="6480" w:hanging="360"/>
+      </w:pPr>
+      <w:rPr>
+        <w:rFonts w:ascii="Wingdings" w:hAnsi="Wingdings" w:hint="default"/>
+        <w:sz w:val="20"/>
+      </w:rPr>
+    </w:lvl>
+  </w:abstractNum>
+  <w:abstractNum w:abstractNumId="12" w15:restartNumberingAfterBreak="0">
     <w:nsid w:val="2D9E3DF8"/>
     <w:multiLevelType w:val="multilevel"/>
     <w:tmpl w:val="1B44623E"/>
@@ -2669,7 +2865,156 @@
       </w:rPr>
     </w:lvl>
   </w:abstractNum>
-  <w:abstractNum w:abstractNumId="12" w15:restartNumberingAfterBreak="0">
+  <w:abstractNum w:abstractNumId="13" w15:restartNumberingAfterBreak="0">
+    <w:nsid w:val="393F77F5"/>
+    <w:multiLevelType w:val="multilevel"/>
+    <w:tmpl w:val="89BA4A84"/>
+    <w:lvl w:ilvl="0">
+      <w:start w:val="1"/>
+      <w:numFmt w:val="bullet"/>
+      <w:lvlText w:val=""/>
+      <w:lvlJc w:val="left"/>
+      <w:pPr>
+        <w:tabs>
+          <w:tab w:val="num" w:pos="720"/>
+        </w:tabs>
+        <w:ind w:left="720" w:hanging="360"/>
+      </w:pPr>
+      <w:rPr>
+        <w:rFonts w:ascii="Symbol" w:hAnsi="Symbol" w:hint="default"/>
+        <w:sz w:val="20"/>
+      </w:rPr>
+    </w:lvl>
+    <w:lvl w:ilvl="1" w:tentative="1">
+      <w:start w:val="1"/>
+      <w:numFmt w:val="bullet"/>
+      <w:lvlText w:val="o"/>
+      <w:lvlJc w:val="left"/>
+      <w:pPr>
+        <w:tabs>
+          <w:tab w:val="num" w:pos="1440"/>
+        </w:tabs>
+        <w:ind w:left="1440" w:hanging="360"/>
+      </w:pPr>
+      <w:rPr>
+        <w:rFonts w:ascii="Courier New" w:hAnsi="Courier New" w:hint="default"/>
+        <w:sz w:val="20"/>
+      </w:rPr>
+    </w:lvl>
+    <w:lvl w:ilvl="2" w:tentative="1">
+      <w:start w:val="1"/>
+      <w:numFmt w:val="bullet"/>
+      <w:lvlText w:val=""/>
+      <w:lvlJc w:val="left"/>
+      <w:pPr>
+        <w:tabs>
+          <w:tab w:val="num" w:pos="2160"/>
+        </w:tabs>
+        <w:ind w:left="2160" w:hanging="360"/>
+      </w:pPr>
+      <w:rPr>
+        <w:rFonts w:ascii="Wingdings" w:hAnsi="Wingdings" w:hint="default"/>
+        <w:sz w:val="20"/>
+      </w:rPr>
+    </w:lvl>
+    <w:lvl w:ilvl="3" w:tentative="1">
+      <w:start w:val="1"/>
+      <w:numFmt w:val="bullet"/>
+      <w:lvlText w:val=""/>
+      <w:lvlJc w:val="left"/>
+      <w:pPr>
+        <w:tabs>
+          <w:tab w:val="num" w:pos="2880"/>
+        </w:tabs>
+        <w:ind w:left="2880" w:hanging="360"/>
+      </w:pPr>
+      <w:rPr>
+        <w:rFonts w:ascii="Wingdings" w:hAnsi="Wingdings" w:hint="default"/>
+        <w:sz w:val="20"/>
+      </w:rPr>
+    </w:lvl>
+    <w:lvl w:ilvl="4" w:tentative="1">
+      <w:start w:val="1"/>
+      <w:numFmt w:val="bullet"/>
+      <w:lvlText w:val=""/>
+      <w:lvlJc w:val="left"/>
+      <w:pPr>
+        <w:tabs>
+          <w:tab w:val="num" w:pos="3600"/>
+        </w:tabs>
+        <w:ind w:left="3600" w:hanging="360"/>
+      </w:pPr>
+      <w:rPr>
+        <w:rFonts w:ascii="Wingdings" w:hAnsi="Wingdings" w:hint="default"/>
+        <w:sz w:val="20"/>
+      </w:rPr>
+    </w:lvl>
+    <w:lvl w:ilvl="5" w:tentative="1">
+      <w:start w:val="1"/>
+      <w:numFmt w:val="bullet"/>
+      <w:lvlText w:val=""/>
+      <w:lvlJc w:val="left"/>
+      <w:pPr>
+        <w:tabs>
+          <w:tab w:val="num" w:pos="4320"/>
+        </w:tabs>
+        <w:ind w:left="4320" w:hanging="360"/>
+      </w:pPr>
+      <w:rPr>
+        <w:rFonts w:ascii="Wingdings" w:hAnsi="Wingdings" w:hint="default"/>
+        <w:sz w:val="20"/>
+      </w:rPr>
+    </w:lvl>
+    <w:lvl w:ilvl="6" w:tentative="1">
+      <w:start w:val="1"/>
+      <w:numFmt w:val="bullet"/>
+      <w:lvlText w:val=""/>
+      <w:lvlJc w:val="left"/>
+      <w:pPr>
+        <w:tabs>
+          <w:tab w:val="num" w:pos="5040"/>
+        </w:tabs>
+        <w:ind w:left="5040" w:hanging="360"/>
+      </w:pPr>
+      <w:rPr>
+        <w:rFonts w:ascii="Wingdings" w:hAnsi="Wingdings" w:hint="default"/>
+        <w:sz w:val="20"/>
+      </w:rPr>
+    </w:lvl>
+    <w:lvl w:ilvl="7" w:tentative="1">
+      <w:start w:val="1"/>
+      <w:numFmt w:val="bullet"/>
+      <w:lvlText w:val=""/>
+      <w:lvlJc w:val="left"/>
+      <w:pPr>
+        <w:tabs>
+          <w:tab w:val="num" w:pos="5760"/>
+        </w:tabs>
+        <w:ind w:left="5760" w:hanging="360"/>
+      </w:pPr>
+      <w:rPr>
+        <w:rFonts w:ascii="Wingdings" w:hAnsi="Wingdings" w:hint="default"/>
+        <w:sz w:val="20"/>
+      </w:rPr>
+    </w:lvl>
+    <w:lvl w:ilvl="8" w:tentative="1">
+      <w:start w:val="1"/>
+      <w:numFmt w:val="bullet"/>
+      <w:lvlText w:val=""/>
+      <w:lvlJc w:val="left"/>
+      <w:pPr>
+        <w:tabs>
+          <w:tab w:val="num" w:pos="6480"/>
+        </w:tabs>
+        <w:ind w:left="6480" w:hanging="360"/>
+      </w:pPr>
+      <w:rPr>
+        <w:rFonts w:ascii="Wingdings" w:hAnsi="Wingdings" w:hint="default"/>
+        <w:sz w:val="20"/>
+      </w:rPr>
+    </w:lvl>
+  </w:abstractNum>
+  <w:abstractNum w:abstractNumId="14" w15:restartNumberingAfterBreak="0">
     <w:nsid w:val="4E653A1E"/>
     <w:multiLevelType w:val="multilevel"/>
     <w:tmpl w:val="C084FDD4"/>
@@ -2818,10 +3163,308 @@
       </w:rPr>
     </w:lvl>
   </w:abstractNum>
-  <w:abstractNum w:abstractNumId="13" w15:restartNumberingAfterBreak="0">
+  <w:abstractNum w:abstractNumId="15" w15:restartNumberingAfterBreak="0">
     <w:nsid w:val="6A46500A"/>
     <w:multiLevelType w:val="multilevel"/>
     <w:tmpl w:val="BAEA3F44"/>
+    <w:lvl w:ilvl="0">
+      <w:start w:val="1"/>
+      <w:numFmt w:val="bullet"/>
+      <w:lvlText w:val=""/>
+      <w:lvlJc w:val="left"/>
+      <w:pPr>
+        <w:tabs>
+          <w:tab w:val="num" w:pos="720"/>
+        </w:tabs>
+        <w:ind w:left="720" w:hanging="360"/>
+      </w:pPr>
+      <w:rPr>
+        <w:rFonts w:ascii="Symbol" w:hAnsi="Symbol" w:hint="default"/>
+        <w:sz w:val="20"/>
+      </w:rPr>
+    </w:lvl>
+    <w:lvl w:ilvl="1" w:tentative="1">
+      <w:start w:val="1"/>
+      <w:numFmt w:val="bullet"/>
+      <w:lvlText w:val="o"/>
+      <w:lvlJc w:val="left"/>
+      <w:pPr>
+        <w:tabs>
+          <w:tab w:val="num" w:pos="1440"/>
+        </w:tabs>
+        <w:ind w:left="1440" w:hanging="360"/>
+      </w:pPr>
+      <w:rPr>
+        <w:rFonts w:ascii="Courier New" w:hAnsi="Courier New" w:hint="default"/>
+        <w:sz w:val="20"/>
+      </w:rPr>
+    </w:lvl>
+    <w:lvl w:ilvl="2" w:tentative="1">
+      <w:start w:val="1"/>
+      <w:numFmt w:val="bullet"/>
+      <w:lvlText w:val=""/>
+      <w:lvlJc w:val="left"/>
+      <w:pPr>
+        <w:tabs>
+          <w:tab w:val="num" w:pos="2160"/>
+        </w:tabs>
+        <w:ind w:left="2160" w:hanging="360"/>
+      </w:pPr>
+      <w:rPr>
+        <w:rFonts w:ascii="Wingdings" w:hAnsi="Wingdings" w:hint="default"/>
+        <w:sz w:val="20"/>
+      </w:rPr>
+    </w:lvl>
+    <w:lvl w:ilvl="3" w:tentative="1">
+      <w:start w:val="1"/>
+      <w:numFmt w:val="bullet"/>
+      <w:lvlText w:val=""/>
+      <w:lvlJc w:val="left"/>
+      <w:pPr>
+        <w:tabs>
+          <w:tab w:val="num" w:pos="2880"/>
+        </w:tabs>
+        <w:ind w:left="2880" w:hanging="360"/>
+      </w:pPr>
+      <w:rPr>
+        <w:rFonts w:ascii="Wingdings" w:hAnsi="Wingdings" w:hint="default"/>
+        <w:sz w:val="20"/>
+      </w:rPr>
+    </w:lvl>
+    <w:lvl w:ilvl="4" w:tentative="1">
+      <w:start w:val="1"/>
+      <w:numFmt w:val="bullet"/>
+      <w:lvlText w:val=""/>
+      <w:lvlJc w:val="left"/>
+      <w:pPr>
+        <w:tabs>
+          <w:tab w:val="num" w:pos="3600"/>
+        </w:tabs>
+        <w:ind w:left="3600" w:hanging="360"/>
+      </w:pPr>
+      <w:rPr>
+        <w:rFonts w:ascii="Wingdings" w:hAnsi="Wingdings" w:hint="default"/>
+        <w:sz w:val="20"/>
+      </w:rPr>
+    </w:lvl>
+    <w:lvl w:ilvl="5" w:tentative="1">
+      <w:start w:val="1"/>
+      <w:numFmt w:val="bullet"/>
+      <w:lvlText w:val=""/>
+      <w:lvlJc w:val="left"/>
+      <w:pPr>
+        <w:tabs>
+          <w:tab w:val="num" w:pos="4320"/>
+        </w:tabs>
+        <w:ind w:left="4320" w:hanging="360"/>
+      </w:pPr>
+      <w:rPr>
+        <w:rFonts w:ascii="Wingdings" w:hAnsi="Wingdings" w:hint="default"/>
+        <w:sz w:val="20"/>
+      </w:rPr>
+    </w:lvl>
+    <w:lvl w:ilvl="6" w:tentative="1">
+      <w:start w:val="1"/>
+      <w:numFmt w:val="bullet"/>
+      <w:lvlText w:val=""/>
+      <w:lvlJc w:val="left"/>
+      <w:pPr>
+        <w:tabs>
+          <w:tab w:val="num" w:pos="5040"/>
+        </w:tabs>
+        <w:ind w:left="5040" w:hanging="360"/>
+      </w:pPr>
+      <w:rPr>
+        <w:rFonts w:ascii="Wingdings" w:hAnsi="Wingdings" w:hint="default"/>
+        <w:sz w:val="20"/>
+      </w:rPr>
+    </w:lvl>
+    <w:lvl w:ilvl="7" w:tentative="1">
+      <w:start w:val="1"/>
+      <w:numFmt w:val="bullet"/>
+      <w:lvlText w:val=""/>
+      <w:lvlJc w:val="left"/>
+      <w:pPr>
+        <w:tabs>
+          <w:tab w:val="num" w:pos="5760"/>
+        </w:tabs>
+        <w:ind w:left="5760" w:hanging="360"/>
+      </w:pPr>
+      <w:rPr>
+        <w:rFonts w:ascii="Wingdings" w:hAnsi="Wingdings" w:hint="default"/>
+        <w:sz w:val="20"/>
+      </w:rPr>
+    </w:lvl>
+    <w:lvl w:ilvl="8" w:tentative="1">
+      <w:start w:val="1"/>
+      <w:numFmt w:val="bullet"/>
+      <w:lvlText w:val=""/>
+      <w:lvlJc w:val="left"/>
+      <w:pPr>
+        <w:tabs>
+          <w:tab w:val="num" w:pos="6480"/>
+        </w:tabs>
+        <w:ind w:left="6480" w:hanging="360"/>
+      </w:pPr>
+      <w:rPr>
+        <w:rFonts w:ascii="Wingdings" w:hAnsi="Wingdings" w:hint="default"/>
+        <w:sz w:val="20"/>
+      </w:rPr>
+    </w:lvl>
+  </w:abstractNum>
+  <w:abstractNum w:abstractNumId="16" w15:restartNumberingAfterBreak="0">
+    <w:nsid w:val="71DD7654"/>
+    <w:multiLevelType w:val="multilevel"/>
+    <w:tmpl w:val="91CA5508"/>
+    <w:lvl w:ilvl="0">
+      <w:start w:val="1"/>
+      <w:numFmt w:val="bullet"/>
+      <w:lvlText w:val=""/>
+      <w:lvlJc w:val="left"/>
+      <w:pPr>
+        <w:tabs>
+          <w:tab w:val="num" w:pos="720"/>
+        </w:tabs>
+        <w:ind w:left="720" w:hanging="360"/>
+      </w:pPr>
+      <w:rPr>
+        <w:rFonts w:ascii="Symbol" w:hAnsi="Symbol" w:hint="default"/>
+        <w:sz w:val="20"/>
+      </w:rPr>
+    </w:lvl>
+    <w:lvl w:ilvl="1" w:tentative="1">
+      <w:start w:val="1"/>
+      <w:numFmt w:val="bullet"/>
+      <w:lvlText w:val="o"/>
+      <w:lvlJc w:val="left"/>
+      <w:pPr>
+        <w:tabs>
+          <w:tab w:val="num" w:pos="1440"/>
+        </w:tabs>
+        <w:ind w:left="1440" w:hanging="360"/>
+      </w:pPr>
+      <w:rPr>
+        <w:rFonts w:ascii="Courier New" w:hAnsi="Courier New" w:hint="default"/>
+        <w:sz w:val="20"/>
+      </w:rPr>
+    </w:lvl>
+    <w:lvl w:ilvl="2" w:tentative="1">
+      <w:start w:val="1"/>
+      <w:numFmt w:val="bullet"/>
+      <w:lvlText w:val=""/>
+      <w:lvlJc w:val="left"/>
+      <w:pPr>
+        <w:tabs>
+          <w:tab w:val="num" w:pos="2160"/>
+        </w:tabs>
+        <w:ind w:left="2160" w:hanging="360"/>
+      </w:pPr>
+      <w:rPr>
+        <w:rFonts w:ascii="Wingdings" w:hAnsi="Wingdings" w:hint="default"/>
+        <w:sz w:val="20"/>
+      </w:rPr>
+    </w:lvl>
+    <w:lvl w:ilvl="3" w:tentative="1">
+      <w:start w:val="1"/>
+      <w:numFmt w:val="bullet"/>
+      <w:lvlText w:val=""/>
+      <w:lvlJc w:val="left"/>
+      <w:pPr>
+        <w:tabs>
+          <w:tab w:val="num" w:pos="2880"/>
+        </w:tabs>
+        <w:ind w:left="2880" w:hanging="360"/>
+      </w:pPr>
+      <w:rPr>
+        <w:rFonts w:ascii="Wingdings" w:hAnsi="Wingdings" w:hint="default"/>
+        <w:sz w:val="20"/>
+      </w:rPr>
+    </w:lvl>
+    <w:lvl w:ilvl="4" w:tentative="1">
+      <w:start w:val="1"/>
+      <w:numFmt w:val="bullet"/>
+      <w:lvlText w:val=""/>
+      <w:lvlJc w:val="left"/>
+      <w:pPr>
+        <w:tabs>
+          <w:tab w:val="num" w:pos="3600"/>
+        </w:tabs>
+        <w:ind w:left="3600" w:hanging="360"/>
+      </w:pPr>
+      <w:rPr>
+        <w:rFonts w:ascii="Wingdings" w:hAnsi="Wingdings" w:hint="default"/>
+        <w:sz w:val="20"/>
+      </w:rPr>
+    </w:lvl>
+    <w:lvl w:ilvl="5" w:tentative="1">
+      <w:start w:val="1"/>
+      <w:numFmt w:val="bullet"/>
+      <w:lvlText w:val=""/>
+      <w:lvlJc w:val="left"/>
+      <w:pPr>
+        <w:tabs>
+          <w:tab w:val="num" w:pos="4320"/>
+        </w:tabs>
+        <w:ind w:left="4320" w:hanging="360"/>
+      </w:pPr>
+      <w:rPr>
+        <w:rFonts w:ascii="Wingdings" w:hAnsi="Wingdings" w:hint="default"/>
+        <w:sz w:val="20"/>
+      </w:rPr>
+    </w:lvl>
+    <w:lvl w:ilvl="6" w:tentative="1">
+      <w:start w:val="1"/>
+      <w:numFmt w:val="bullet"/>
+      <w:lvlText w:val=""/>
+      <w:lvlJc w:val="left"/>
+      <w:pPr>
+        <w:tabs>
+          <w:tab w:val="num" w:pos="5040"/>
+        </w:tabs>
+        <w:ind w:left="5040" w:hanging="360"/>
+      </w:pPr>
+      <w:rPr>
+        <w:rFonts w:ascii="Wingdings" w:hAnsi="Wingdings" w:hint="default"/>
+        <w:sz w:val="20"/>
+      </w:rPr>
+    </w:lvl>
+    <w:lvl w:ilvl="7" w:tentative="1">
+      <w:start w:val="1"/>
+      <w:numFmt w:val="bullet"/>
+      <w:lvlText w:val=""/>
+      <w:lvlJc w:val="left"/>
+      <w:pPr>
+        <w:tabs>
+          <w:tab w:val="num" w:pos="5760"/>
+        </w:tabs>
+        <w:ind w:left="5760" w:hanging="360"/>
+      </w:pPr>
+      <w:rPr>
+        <w:rFonts w:ascii="Wingdings" w:hAnsi="Wingdings" w:hint="default"/>
+        <w:sz w:val="20"/>
+      </w:rPr>
+    </w:lvl>
+    <w:lvl w:ilvl="8" w:tentative="1">
+      <w:start w:val="1"/>
+      <w:numFmt w:val="bullet"/>
+      <w:lvlText w:val=""/>
+      <w:lvlJc w:val="left"/>
+      <w:pPr>
+        <w:tabs>
+          <w:tab w:val="num" w:pos="6480"/>
+        </w:tabs>
+        <w:ind w:left="6480" w:hanging="360"/>
+      </w:pPr>
+      <w:rPr>
+        <w:rFonts w:ascii="Wingdings" w:hAnsi="Wingdings" w:hint="default"/>
+        <w:sz w:val="20"/>
+      </w:rPr>
+    </w:lvl>
+  </w:abstractNum>
+  <w:abstractNum w:abstractNumId="17" w15:restartNumberingAfterBreak="0">
+    <w:nsid w:val="7884249F"/>
+    <w:multiLevelType w:val="multilevel"/>
+    <w:tmpl w:val="47B41712"/>
     <w:lvl w:ilvl="0">
       <w:start w:val="1"/>
       <w:numFmt w:val="bullet"/>
@@ -2974,13 +3617,28 @@
     <w:abstractNumId w:val="0"/>
   </w:num>
   <w:num w:numId="3" w16cid:durableId="892231471">
+    <w:abstractNumId w:val="14"/>
+  </w:num>
+  <w:num w:numId="4" w16cid:durableId="1312565478">
+    <w:abstractNumId w:val="15"/>
+  </w:num>
+  <w:num w:numId="5" w16cid:durableId="1101686865">
     <w:abstractNumId w:val="12"/>
   </w:num>
-  <w:num w:numId="4" w16cid:durableId="1312565478">
+  <w:num w:numId="6" w16cid:durableId="1725443760">
+    <w:abstractNumId w:val="9"/>
+  </w:num>
+  <w:num w:numId="7" w16cid:durableId="465633854">
+    <w:abstractNumId w:val="11"/>
+  </w:num>
+  <w:num w:numId="8" w16cid:durableId="1202399684">
+    <w:abstractNumId w:val="16"/>
+  </w:num>
+  <w:num w:numId="9" w16cid:durableId="1211921261">
+    <w:abstractNumId w:val="17"/>
+  </w:num>
+  <w:num w:numId="10" w16cid:durableId="7097163">
     <w:abstractNumId w:val="13"/>
-  </w:num>
-  <w:num w:numId="5" w16cid:durableId="1101686865">
-    <w:abstractNumId w:val="11"/>
   </w:num>
 </w:numbering>
 </file>

</xml_diff>